<commit_message>
Aufklärung Herz-CT ergänzt, Laborfristen nach ESUR 2025
- Aufklärung: Betablocker, Nitrospray, Kontrastmittel/Niere/Schilddrüse,
  Strahlung, Fahrtüchtigkeit; Fragen zu Herzrhythmus und Potenzmitteln;
  ärztliche Unterschrift; Frage nach Infektionskrankheiten entfernt
- Laufzettel und Patientenseite: nicht selbst Auto fahren
- Zuweiser: Kreatinin bei akuter Erkrankung max. 7 Tage, ESUR als Quelle

Co-Authored-By: Claude Opus 5.5 <noreply@anthropic.com>
Claude-Session: https://claude.ai/code/session_01VnQ85SLBBZDMd7wK23yYnL
</commit_message>
<xml_diff>
--- a/docs/vorlagen/aufklaerung-herz-ct-radiologie-dammtor.docx
+++ b/docs/vorlagen/aufklaerung-herz-ct-radiologie-dammtor.docx
@@ -341,7 +341,7 @@
           <w:szCs w:val="18"/>
           <w:shd w:fill="007AA8" w:color="auto" w:val="clear"/>
         </w:rPr>
-        <w:t xml:space="preserve"> 1 </w:t>
+        <w:t xml:space="preserve"> i </w:t>
       </w:r>
       <w:r>
         <w:rPr>
@@ -363,1097 +363,159 @@
           <w:sz w:val="20"/>
           <w:szCs w:val="20"/>
         </w:rPr>
-        <w:t xml:space="preserve">Bitte beantworten Sie uns vor der Untersuchung folgende Fragen</w:t>
+        <w:t xml:space="preserve">Besonderheiten beim Herz-CT</w:t>
       </w:r>
     </w:p>
-    <w:tbl>
-      <w:tblPr>
-        <w:tblW w:type="dxa" w:w="10204"/>
-        <w:tblBorders>
-          <w:top w:val="none" w:color="FFFFFF" w:sz="0"/>
-          <w:left w:val="none" w:color="FFFFFF" w:sz="0"/>
-          <w:bottom w:val="none" w:color="FFFFFF" w:sz="0"/>
-          <w:right w:val="none" w:color="FFFFFF" w:sz="0"/>
-          <w:insideH w:val="none" w:color="FFFFFF" w:sz="0"/>
-          <w:insideV w:val="none" w:color="FFFFFF" w:sz="0"/>
-        </w:tblBorders>
-        <w:tblLayout w:type="fixed"/>
-      </w:tblPr>
-      <w:tblGrid>
-        <w:gridCol w:w="8804"/>
-        <w:gridCol w:w="700"/>
-        <w:gridCol w:w="700"/>
-      </w:tblGrid>
-      <w:tr>
-        <w:tc>
-          <w:tcPr>
-            <w:tcW w:type="dxa" w:w="8804"/>
-            <w:tcBorders>
-              <w:top w:val="none" w:color="FFFFFF" w:sz="0"/>
-              <w:left w:val="none" w:color="FFFFFF" w:sz="0"/>
-              <w:bottom w:val="none" w:color="FFFFFF" w:sz="0"/>
-              <w:right w:val="none" w:color="FFFFFF" w:sz="0"/>
-            </w:tcBorders>
-            <w:tcMar>
-              <w:top w:type="dxa" w:w="60"/>
-              <w:left w:type="dxa" w:w="100"/>
-              <w:bottom w:type="dxa" w:w="60"/>
-              <w:right w:type="dxa" w:w="100"/>
-            </w:tcMar>
-          </w:tcPr>
-          <w:p>
-            <w:pPr>
-              <w:spacing w:after="60" w:before="0"/>
-            </w:pPr>
-            <w:r>
-              <w:rPr>
-                <w:rFonts w:ascii="Arial" w:cs="Arial" w:eastAsia="Arial" w:hAnsi="Arial"/>
-                <w:color w:val="5D534C"/>
-                <w:sz w:val="18"/>
-                <w:szCs w:val="18"/>
-              </w:rPr>
-              <w:t xml:space="preserve"/>
-            </w:r>
-          </w:p>
-        </w:tc>
-        <w:tc>
-          <w:tcPr>
-            <w:tcW w:type="dxa" w:w="700"/>
-            <w:tcBorders>
-              <w:top w:val="none" w:color="FFFFFF" w:sz="0"/>
-              <w:left w:val="none" w:color="FFFFFF" w:sz="0"/>
-              <w:bottom w:val="none" w:color="FFFFFF" w:sz="0"/>
-              <w:right w:val="none" w:color="FFFFFF" w:sz="0"/>
-            </w:tcBorders>
-            <w:tcMar>
-              <w:top w:type="dxa" w:w="60"/>
-              <w:left w:type="dxa" w:w="100"/>
-              <w:bottom w:type="dxa" w:w="60"/>
-              <w:right w:type="dxa" w:w="100"/>
-            </w:tcMar>
-          </w:tcPr>
-          <w:p>
-            <w:pPr>
-              <w:spacing w:after="0" w:before="0"/>
-              <w:jc w:val="center"/>
-            </w:pPr>
-            <w:r>
-              <w:rPr>
-                <w:rFonts w:ascii="Arial" w:cs="Arial" w:eastAsia="Arial" w:hAnsi="Arial"/>
-                <w:b/>
-                <w:bCs/>
-                <w:caps/>
-                <w:color w:val="7C6E65"/>
-                <w:sz w:val="14"/>
-                <w:szCs w:val="14"/>
-              </w:rPr>
-              <w:t xml:space="preserve">nein</w:t>
-            </w:r>
-          </w:p>
-        </w:tc>
-        <w:tc>
-          <w:tcPr>
-            <w:tcW w:type="dxa" w:w="700"/>
-            <w:tcBorders>
-              <w:top w:val="none" w:color="FFFFFF" w:sz="0"/>
-              <w:left w:val="none" w:color="FFFFFF" w:sz="0"/>
-              <w:bottom w:val="none" w:color="FFFFFF" w:sz="0"/>
-              <w:right w:val="none" w:color="FFFFFF" w:sz="0"/>
-            </w:tcBorders>
-            <w:tcMar>
-              <w:top w:type="dxa" w:w="60"/>
-              <w:left w:type="dxa" w:w="100"/>
-              <w:bottom w:type="dxa" w:w="60"/>
-              <w:right w:type="dxa" w:w="100"/>
-            </w:tcMar>
-          </w:tcPr>
-          <w:p>
-            <w:pPr>
-              <w:spacing w:after="0" w:before="0"/>
-              <w:jc w:val="center"/>
-            </w:pPr>
-            <w:r>
-              <w:rPr>
-                <w:rFonts w:ascii="Arial" w:cs="Arial" w:eastAsia="Arial" w:hAnsi="Arial"/>
-                <w:b/>
-                <w:bCs/>
-                <w:caps/>
-                <w:color w:val="7C6E65"/>
-                <w:sz w:val="14"/>
-                <w:szCs w:val="14"/>
-              </w:rPr>
-              <w:t xml:space="preserve">ja</w:t>
-            </w:r>
-          </w:p>
-        </w:tc>
-      </w:tr>
-      <w:tr>
-        <w:tc>
-          <w:tcPr>
-            <w:tcW w:type="dxa" w:w="8804"/>
-            <w:tcBorders>
-              <w:top w:val="single" w:color="D4D0C5" w:sz="4"/>
-              <w:left w:val="none" w:color="FFFFFF" w:sz="0"/>
-              <w:bottom w:val="none" w:color="FFFFFF" w:sz="0"/>
-              <w:right w:val="none" w:color="FFFFFF" w:sz="0"/>
-            </w:tcBorders>
-            <w:tcMar>
-              <w:top w:type="dxa" w:w="60"/>
-              <w:left w:type="dxa" w:w="0"/>
-              <w:bottom w:type="dxa" w:w="60"/>
-              <w:right w:type="dxa" w:w="100"/>
-            </w:tcMar>
-          </w:tcPr>
-          <w:p>
-            <w:pPr>
-              <w:spacing w:after="0" w:before="0"/>
-            </w:pPr>
-            <w:r>
-              <w:rPr>
-                <w:rFonts w:ascii="Arial" w:cs="Arial" w:eastAsia="Arial" w:hAnsi="Arial"/>
-                <w:color w:val="5D534C"/>
-                <w:sz w:val="18"/>
-                <w:szCs w:val="18"/>
-              </w:rPr>
-              <w:t xml:space="preserve">Haben Sie eine Nierenerkrankung?</w:t>
-            </w:r>
-          </w:p>
-        </w:tc>
-        <w:tc>
-          <w:tcPr>
-            <w:tcW w:type="dxa" w:w="700"/>
-            <w:tcBorders>
-              <w:top w:val="single" w:color="D4D0C5" w:sz="4"/>
-              <w:left w:val="none" w:color="FFFFFF" w:sz="0"/>
-              <w:bottom w:val="none" w:color="FFFFFF" w:sz="0"/>
-              <w:right w:val="none" w:color="FFFFFF" w:sz="0"/>
-            </w:tcBorders>
-            <w:tcMar>
-              <w:top w:type="dxa" w:w="60"/>
-              <w:left w:type="dxa" w:w="100"/>
-              <w:bottom w:type="dxa" w:w="60"/>
-              <w:right w:type="dxa" w:w="100"/>
-            </w:tcMar>
-          </w:tcPr>
-          <w:p>
-            <w:pPr>
-              <w:spacing w:after="0" w:before="0"/>
-              <w:jc w:val="center"/>
-            </w:pPr>
-            <w:r>
-              <w:rPr>
-                <w:rFonts w:ascii="Segoe UI Symbol" w:cs="Segoe UI Symbol" w:eastAsia="Segoe UI Symbol" w:hAnsi="Segoe UI Symbol"/>
-                <w:color w:val="5D534C"/>
-                <w:sz w:val="20"/>
-                <w:szCs w:val="20"/>
-              </w:rPr>
-              <w:t xml:space="preserve">☐ </w:t>
-            </w:r>
-          </w:p>
-        </w:tc>
-        <w:tc>
-          <w:tcPr>
-            <w:tcW w:type="dxa" w:w="700"/>
-            <w:tcBorders>
-              <w:top w:val="single" w:color="D4D0C5" w:sz="4"/>
-              <w:left w:val="none" w:color="FFFFFF" w:sz="0"/>
-              <w:bottom w:val="none" w:color="FFFFFF" w:sz="0"/>
-              <w:right w:val="none" w:color="FFFFFF" w:sz="0"/>
-            </w:tcBorders>
-            <w:tcMar>
-              <w:top w:type="dxa" w:w="60"/>
-              <w:left w:type="dxa" w:w="100"/>
-              <w:bottom w:type="dxa" w:w="60"/>
-              <w:right w:type="dxa" w:w="100"/>
-            </w:tcMar>
-          </w:tcPr>
-          <w:p>
-            <w:pPr>
-              <w:spacing w:after="0" w:before="0"/>
-              <w:jc w:val="center"/>
-            </w:pPr>
-            <w:r>
-              <w:rPr>
-                <w:rFonts w:ascii="Segoe UI Symbol" w:cs="Segoe UI Symbol" w:eastAsia="Segoe UI Symbol" w:hAnsi="Segoe UI Symbol"/>
-                <w:color w:val="5D534C"/>
-                <w:sz w:val="20"/>
-                <w:szCs w:val="20"/>
-              </w:rPr>
-              <w:t xml:space="preserve">☐ </w:t>
-            </w:r>
-          </w:p>
-        </w:tc>
-      </w:tr>
-      <w:tr>
-        <w:tc>
-          <w:tcPr>
-            <w:tcW w:type="dxa" w:w="8804"/>
-            <w:tcBorders>
-              <w:top w:val="single" w:color="D4D0C5" w:sz="4"/>
-              <w:left w:val="none" w:color="FFFFFF" w:sz="0"/>
-              <w:bottom w:val="none" w:color="FFFFFF" w:sz="0"/>
-              <w:right w:val="none" w:color="FFFFFF" w:sz="0"/>
-            </w:tcBorders>
-            <w:tcMar>
-              <w:top w:type="dxa" w:w="60"/>
-              <w:left w:type="dxa" w:w="0"/>
-              <w:bottom w:type="dxa" w:w="60"/>
-              <w:right w:type="dxa" w:w="100"/>
-            </w:tcMar>
-          </w:tcPr>
-          <w:p>
-            <w:pPr>
-              <w:spacing w:after="0" w:before="0"/>
-            </w:pPr>
-            <w:r>
-              <w:rPr>
-                <w:rFonts w:ascii="Arial" w:cs="Arial" w:eastAsia="Arial" w:hAnsi="Arial"/>
-                <w:color w:val="5D534C"/>
-                <w:sz w:val="18"/>
-                <w:szCs w:val="18"/>
-              </w:rPr>
-              <w:t xml:space="preserve">Ist eine Überfunktion der Schilddrüse bekannt?</w:t>
-            </w:r>
-          </w:p>
-        </w:tc>
-        <w:tc>
-          <w:tcPr>
-            <w:tcW w:type="dxa" w:w="700"/>
-            <w:tcBorders>
-              <w:top w:val="single" w:color="D4D0C5" w:sz="4"/>
-              <w:left w:val="none" w:color="FFFFFF" w:sz="0"/>
-              <w:bottom w:val="none" w:color="FFFFFF" w:sz="0"/>
-              <w:right w:val="none" w:color="FFFFFF" w:sz="0"/>
-            </w:tcBorders>
-            <w:tcMar>
-              <w:top w:type="dxa" w:w="60"/>
-              <w:left w:type="dxa" w:w="100"/>
-              <w:bottom w:type="dxa" w:w="60"/>
-              <w:right w:type="dxa" w:w="100"/>
-            </w:tcMar>
-          </w:tcPr>
-          <w:p>
-            <w:pPr>
-              <w:spacing w:after="0" w:before="0"/>
-              <w:jc w:val="center"/>
-            </w:pPr>
-            <w:r>
-              <w:rPr>
-                <w:rFonts w:ascii="Segoe UI Symbol" w:cs="Segoe UI Symbol" w:eastAsia="Segoe UI Symbol" w:hAnsi="Segoe UI Symbol"/>
-                <w:color w:val="5D534C"/>
-                <w:sz w:val="20"/>
-                <w:szCs w:val="20"/>
-              </w:rPr>
-              <w:t xml:space="preserve">☐ </w:t>
-            </w:r>
-          </w:p>
-        </w:tc>
-        <w:tc>
-          <w:tcPr>
-            <w:tcW w:type="dxa" w:w="700"/>
-            <w:tcBorders>
-              <w:top w:val="single" w:color="D4D0C5" w:sz="4"/>
-              <w:left w:val="none" w:color="FFFFFF" w:sz="0"/>
-              <w:bottom w:val="none" w:color="FFFFFF" w:sz="0"/>
-              <w:right w:val="none" w:color="FFFFFF" w:sz="0"/>
-            </w:tcBorders>
-            <w:tcMar>
-              <w:top w:type="dxa" w:w="60"/>
-              <w:left w:type="dxa" w:w="100"/>
-              <w:bottom w:type="dxa" w:w="60"/>
-              <w:right w:type="dxa" w:w="100"/>
-            </w:tcMar>
-          </w:tcPr>
-          <w:p>
-            <w:pPr>
-              <w:spacing w:after="0" w:before="0"/>
-              <w:jc w:val="center"/>
-            </w:pPr>
-            <w:r>
-              <w:rPr>
-                <w:rFonts w:ascii="Segoe UI Symbol" w:cs="Segoe UI Symbol" w:eastAsia="Segoe UI Symbol" w:hAnsi="Segoe UI Symbol"/>
-                <w:color w:val="5D534C"/>
-                <w:sz w:val="20"/>
-                <w:szCs w:val="20"/>
-              </w:rPr>
-              <w:t xml:space="preserve">☐ </w:t>
-            </w:r>
-          </w:p>
-        </w:tc>
-      </w:tr>
-      <w:tr>
-        <w:tc>
-          <w:tcPr>
-            <w:tcW w:type="dxa" w:w="8804"/>
-            <w:tcBorders>
-              <w:top w:val="single" w:color="D4D0C5" w:sz="4"/>
-              <w:left w:val="none" w:color="FFFFFF" w:sz="0"/>
-              <w:bottom w:val="none" w:color="FFFFFF" w:sz="0"/>
-              <w:right w:val="none" w:color="FFFFFF" w:sz="0"/>
-            </w:tcBorders>
-            <w:tcMar>
-              <w:top w:type="dxa" w:w="60"/>
-              <w:left w:type="dxa" w:w="0"/>
-              <w:bottom w:type="dxa" w:w="60"/>
-              <w:right w:type="dxa" w:w="100"/>
-            </w:tcMar>
-          </w:tcPr>
-          <w:p>
-            <w:pPr>
-              <w:spacing w:after="0" w:before="0"/>
-            </w:pPr>
-            <w:r>
-              <w:rPr>
-                <w:rFonts w:ascii="Arial" w:cs="Arial" w:eastAsia="Arial" w:hAnsi="Arial"/>
-                <w:color w:val="5D534C"/>
-                <w:sz w:val="18"/>
-                <w:szCs w:val="18"/>
-              </w:rPr>
-              <w:t xml:space="preserve">Haben Sie eine Kontrastmittelallergie oder Medikamentenallergie?</w:t>
-            </w:r>
-          </w:p>
-        </w:tc>
-        <w:tc>
-          <w:tcPr>
-            <w:tcW w:type="dxa" w:w="700"/>
-            <w:tcBorders>
-              <w:top w:val="single" w:color="D4D0C5" w:sz="4"/>
-              <w:left w:val="none" w:color="FFFFFF" w:sz="0"/>
-              <w:bottom w:val="none" w:color="FFFFFF" w:sz="0"/>
-              <w:right w:val="none" w:color="FFFFFF" w:sz="0"/>
-            </w:tcBorders>
-            <w:tcMar>
-              <w:top w:type="dxa" w:w="60"/>
-              <w:left w:type="dxa" w:w="100"/>
-              <w:bottom w:type="dxa" w:w="60"/>
-              <w:right w:type="dxa" w:w="100"/>
-            </w:tcMar>
-          </w:tcPr>
-          <w:p>
-            <w:pPr>
-              <w:spacing w:after="0" w:before="0"/>
-              <w:jc w:val="center"/>
-            </w:pPr>
-            <w:r>
-              <w:rPr>
-                <w:rFonts w:ascii="Segoe UI Symbol" w:cs="Segoe UI Symbol" w:eastAsia="Segoe UI Symbol" w:hAnsi="Segoe UI Symbol"/>
-                <w:color w:val="5D534C"/>
-                <w:sz w:val="20"/>
-                <w:szCs w:val="20"/>
-              </w:rPr>
-              <w:t xml:space="preserve">☐ </w:t>
-            </w:r>
-          </w:p>
-        </w:tc>
-        <w:tc>
-          <w:tcPr>
-            <w:tcW w:type="dxa" w:w="700"/>
-            <w:tcBorders>
-              <w:top w:val="single" w:color="D4D0C5" w:sz="4"/>
-              <w:left w:val="none" w:color="FFFFFF" w:sz="0"/>
-              <w:bottom w:val="none" w:color="FFFFFF" w:sz="0"/>
-              <w:right w:val="none" w:color="FFFFFF" w:sz="0"/>
-            </w:tcBorders>
-            <w:tcMar>
-              <w:top w:type="dxa" w:w="60"/>
-              <w:left w:type="dxa" w:w="100"/>
-              <w:bottom w:type="dxa" w:w="60"/>
-              <w:right w:type="dxa" w:w="100"/>
-            </w:tcMar>
-          </w:tcPr>
-          <w:p>
-            <w:pPr>
-              <w:spacing w:after="0" w:before="0"/>
-              <w:jc w:val="center"/>
-            </w:pPr>
-            <w:r>
-              <w:rPr>
-                <w:rFonts w:ascii="Segoe UI Symbol" w:cs="Segoe UI Symbol" w:eastAsia="Segoe UI Symbol" w:hAnsi="Segoe UI Symbol"/>
-                <w:color w:val="5D534C"/>
-                <w:sz w:val="20"/>
-                <w:szCs w:val="20"/>
-              </w:rPr>
-              <w:t xml:space="preserve">☐ </w:t>
-            </w:r>
-          </w:p>
-        </w:tc>
-      </w:tr>
-      <w:tr>
-        <w:tc>
-          <w:tcPr>
-            <w:tcW w:type="dxa" w:w="8804"/>
-            <w:tcBorders>
-              <w:top w:val="single" w:color="D4D0C5" w:sz="4"/>
-              <w:left w:val="none" w:color="FFFFFF" w:sz="0"/>
-              <w:bottom w:val="none" w:color="FFFFFF" w:sz="0"/>
-              <w:right w:val="none" w:color="FFFFFF" w:sz="0"/>
-            </w:tcBorders>
-            <w:tcMar>
-              <w:top w:type="dxa" w:w="60"/>
-              <w:left w:type="dxa" w:w="0"/>
-              <w:bottom w:type="dxa" w:w="60"/>
-              <w:right w:type="dxa" w:w="100"/>
-            </w:tcMar>
-          </w:tcPr>
-          <w:p>
-            <w:pPr>
-              <w:spacing w:after="20" w:before="0"/>
-            </w:pPr>
-            <w:r>
-              <w:rPr>
-                <w:rFonts w:ascii="Arial" w:cs="Arial" w:eastAsia="Arial" w:hAnsi="Arial"/>
-                <w:color w:val="5D534C"/>
-                <w:sz w:val="18"/>
-                <w:szCs w:val="18"/>
-              </w:rPr>
-              <w:t xml:space="preserve">Sind Sie zuckerkrank, nehmen Sie dafür Medikamente ein?</w:t>
-            </w:r>
-          </w:p>
-          <w:p>
-            <w:pPr>
-              <w:spacing w:after="0" w:before="0"/>
-            </w:pPr>
-            <w:r>
-              <w:rPr>
-                <w:rFonts w:ascii="Arial" w:cs="Arial" w:eastAsia="Arial" w:hAnsi="Arial"/>
-                <w:color w:val="7C6E65"/>
-                <w:sz w:val="16"/>
-                <w:szCs w:val="16"/>
-              </w:rPr>
-              <w:t xml:space="preserve">Wenn ja, welche?</w:t>
-            </w:r>
-          </w:p>
-          <w:p>
-            <w:pPr>
-              <w:pBdr>
-                <w:bottom w:val="single" w:color="7C6E65" w:sz="6" w:space="1"/>
-              </w:pBdr>
-              <w:spacing w:after="40" w:before="260"/>
-            </w:pPr>
-            <w:r>
-              <w:rPr>
-                <w:rFonts w:ascii="Arial" w:cs="Arial" w:eastAsia="Arial" w:hAnsi="Arial"/>
-                <w:color w:val="5D534C"/>
-                <w:sz w:val="18"/>
-                <w:szCs w:val="18"/>
-              </w:rPr>
-              <w:t xml:space="preserve"/>
-            </w:r>
-          </w:p>
-        </w:tc>
-        <w:tc>
-          <w:tcPr>
-            <w:tcW w:type="dxa" w:w="700"/>
-            <w:tcBorders>
-              <w:top w:val="single" w:color="D4D0C5" w:sz="4"/>
-              <w:left w:val="none" w:color="FFFFFF" w:sz="0"/>
-              <w:bottom w:val="none" w:color="FFFFFF" w:sz="0"/>
-              <w:right w:val="none" w:color="FFFFFF" w:sz="0"/>
-            </w:tcBorders>
-            <w:tcMar>
-              <w:top w:type="dxa" w:w="60"/>
-              <w:left w:type="dxa" w:w="100"/>
-              <w:bottom w:type="dxa" w:w="60"/>
-              <w:right w:type="dxa" w:w="100"/>
-            </w:tcMar>
-          </w:tcPr>
-          <w:p>
-            <w:pPr>
-              <w:spacing w:after="0" w:before="0"/>
-              <w:jc w:val="center"/>
-            </w:pPr>
-            <w:r>
-              <w:rPr>
-                <w:rFonts w:ascii="Segoe UI Symbol" w:cs="Segoe UI Symbol" w:eastAsia="Segoe UI Symbol" w:hAnsi="Segoe UI Symbol"/>
-                <w:color w:val="5D534C"/>
-                <w:sz w:val="20"/>
-                <w:szCs w:val="20"/>
-              </w:rPr>
-              <w:t xml:space="preserve">☐ </w:t>
-            </w:r>
-          </w:p>
-        </w:tc>
-        <w:tc>
-          <w:tcPr>
-            <w:tcW w:type="dxa" w:w="700"/>
-            <w:tcBorders>
-              <w:top w:val="single" w:color="D4D0C5" w:sz="4"/>
-              <w:left w:val="none" w:color="FFFFFF" w:sz="0"/>
-              <w:bottom w:val="none" w:color="FFFFFF" w:sz="0"/>
-              <w:right w:val="none" w:color="FFFFFF" w:sz="0"/>
-            </w:tcBorders>
-            <w:tcMar>
-              <w:top w:type="dxa" w:w="60"/>
-              <w:left w:type="dxa" w:w="100"/>
-              <w:bottom w:type="dxa" w:w="60"/>
-              <w:right w:type="dxa" w:w="100"/>
-            </w:tcMar>
-          </w:tcPr>
-          <w:p>
-            <w:pPr>
-              <w:spacing w:after="0" w:before="0"/>
-              <w:jc w:val="center"/>
-            </w:pPr>
-            <w:r>
-              <w:rPr>
-                <w:rFonts w:ascii="Segoe UI Symbol" w:cs="Segoe UI Symbol" w:eastAsia="Segoe UI Symbol" w:hAnsi="Segoe UI Symbol"/>
-                <w:color w:val="5D534C"/>
-                <w:sz w:val="20"/>
-                <w:szCs w:val="20"/>
-              </w:rPr>
-              <w:t xml:space="preserve">☐ </w:t>
-            </w:r>
-          </w:p>
-        </w:tc>
-      </w:tr>
-      <w:tr>
-        <w:tc>
-          <w:tcPr>
-            <w:tcW w:type="dxa" w:w="8804"/>
-            <w:tcBorders>
-              <w:top w:val="single" w:color="D4D0C5" w:sz="4"/>
-              <w:left w:val="none" w:color="FFFFFF" w:sz="0"/>
-              <w:bottom w:val="none" w:color="FFFFFF" w:sz="0"/>
-              <w:right w:val="none" w:color="FFFFFF" w:sz="0"/>
-            </w:tcBorders>
-            <w:tcMar>
-              <w:top w:type="dxa" w:w="60"/>
-              <w:left w:type="dxa" w:w="0"/>
-              <w:bottom w:type="dxa" w:w="60"/>
-              <w:right w:type="dxa" w:w="100"/>
-            </w:tcMar>
-          </w:tcPr>
-          <w:p>
-            <w:pPr>
-              <w:spacing w:after="0" w:before="0"/>
-            </w:pPr>
-            <w:r>
-              <w:rPr>
-                <w:rFonts w:ascii="Arial" w:cs="Arial" w:eastAsia="Arial" w:hAnsi="Arial"/>
-                <w:color w:val="5D534C"/>
-                <w:sz w:val="18"/>
-                <w:szCs w:val="18"/>
-              </w:rPr>
-              <w:t xml:space="preserve">Könnte bei Ihnen eine Schwangerschaft vorliegen?</w:t>
-            </w:r>
-          </w:p>
-        </w:tc>
-        <w:tc>
-          <w:tcPr>
-            <w:tcW w:type="dxa" w:w="700"/>
-            <w:tcBorders>
-              <w:top w:val="single" w:color="D4D0C5" w:sz="4"/>
-              <w:left w:val="none" w:color="FFFFFF" w:sz="0"/>
-              <w:bottom w:val="none" w:color="FFFFFF" w:sz="0"/>
-              <w:right w:val="none" w:color="FFFFFF" w:sz="0"/>
-            </w:tcBorders>
-            <w:tcMar>
-              <w:top w:type="dxa" w:w="60"/>
-              <w:left w:type="dxa" w:w="100"/>
-              <w:bottom w:type="dxa" w:w="60"/>
-              <w:right w:type="dxa" w:w="100"/>
-            </w:tcMar>
-          </w:tcPr>
-          <w:p>
-            <w:pPr>
-              <w:spacing w:after="0" w:before="0"/>
-              <w:jc w:val="center"/>
-            </w:pPr>
-            <w:r>
-              <w:rPr>
-                <w:rFonts w:ascii="Segoe UI Symbol" w:cs="Segoe UI Symbol" w:eastAsia="Segoe UI Symbol" w:hAnsi="Segoe UI Symbol"/>
-                <w:color w:val="5D534C"/>
-                <w:sz w:val="20"/>
-                <w:szCs w:val="20"/>
-              </w:rPr>
-              <w:t xml:space="preserve">☐ </w:t>
-            </w:r>
-          </w:p>
-        </w:tc>
-        <w:tc>
-          <w:tcPr>
-            <w:tcW w:type="dxa" w:w="700"/>
-            <w:tcBorders>
-              <w:top w:val="single" w:color="D4D0C5" w:sz="4"/>
-              <w:left w:val="none" w:color="FFFFFF" w:sz="0"/>
-              <w:bottom w:val="none" w:color="FFFFFF" w:sz="0"/>
-              <w:right w:val="none" w:color="FFFFFF" w:sz="0"/>
-            </w:tcBorders>
-            <w:tcMar>
-              <w:top w:type="dxa" w:w="60"/>
-              <w:left w:type="dxa" w:w="100"/>
-              <w:bottom w:type="dxa" w:w="60"/>
-              <w:right w:type="dxa" w:w="100"/>
-            </w:tcMar>
-          </w:tcPr>
-          <w:p>
-            <w:pPr>
-              <w:spacing w:after="0" w:before="0"/>
-              <w:jc w:val="center"/>
-            </w:pPr>
-            <w:r>
-              <w:rPr>
-                <w:rFonts w:ascii="Segoe UI Symbol" w:cs="Segoe UI Symbol" w:eastAsia="Segoe UI Symbol" w:hAnsi="Segoe UI Symbol"/>
-                <w:color w:val="5D534C"/>
-                <w:sz w:val="20"/>
-                <w:szCs w:val="20"/>
-              </w:rPr>
-              <w:t xml:space="preserve">☐ </w:t>
-            </w:r>
-          </w:p>
-        </w:tc>
-      </w:tr>
-      <w:tr>
-        <w:tc>
-          <w:tcPr>
-            <w:tcW w:type="dxa" w:w="8804"/>
-            <w:tcBorders>
-              <w:top w:val="single" w:color="D4D0C5" w:sz="4"/>
-              <w:left w:val="none" w:color="FFFFFF" w:sz="0"/>
-              <w:bottom w:val="none" w:color="FFFFFF" w:sz="0"/>
-              <w:right w:val="none" w:color="FFFFFF" w:sz="0"/>
-            </w:tcBorders>
-            <w:tcMar>
-              <w:top w:type="dxa" w:w="60"/>
-              <w:left w:type="dxa" w:w="0"/>
-              <w:bottom w:type="dxa" w:w="60"/>
-              <w:right w:type="dxa" w:w="100"/>
-            </w:tcMar>
-          </w:tcPr>
-          <w:p>
-            <w:pPr>
-              <w:spacing w:after="20" w:before="0"/>
-            </w:pPr>
-            <w:r>
-              <w:rPr>
-                <w:rFonts w:ascii="Arial" w:cs="Arial" w:eastAsia="Arial" w:hAnsi="Arial"/>
-                <w:color w:val="5D534C"/>
-                <w:sz w:val="18"/>
-                <w:szCs w:val="18"/>
-              </w:rPr>
-              <w:t xml:space="preserve">Besteht eine Herz-/Kreislauferkrankung (z. B. koronare Herzkrankheit, Bluthochdruck)?</w:t>
-            </w:r>
-          </w:p>
-          <w:p>
-            <w:pPr>
-              <w:spacing w:after="0" w:before="0"/>
-            </w:pPr>
-            <w:r>
-              <w:rPr>
-                <w:rFonts w:ascii="Arial" w:cs="Arial" w:eastAsia="Arial" w:hAnsi="Arial"/>
-                <w:color w:val="7C6E65"/>
-                <w:sz w:val="16"/>
-                <w:szCs w:val="16"/>
-              </w:rPr>
-              <w:t xml:space="preserve">Wenn ja, bitte angeben:</w:t>
-            </w:r>
-          </w:p>
-          <w:p>
-            <w:pPr>
-              <w:pBdr>
-                <w:bottom w:val="single" w:color="7C6E65" w:sz="6" w:space="1"/>
-              </w:pBdr>
-              <w:spacing w:after="40" w:before="260"/>
-            </w:pPr>
-            <w:r>
-              <w:rPr>
-                <w:rFonts w:ascii="Arial" w:cs="Arial" w:eastAsia="Arial" w:hAnsi="Arial"/>
-                <w:color w:val="5D534C"/>
-                <w:sz w:val="18"/>
-                <w:szCs w:val="18"/>
-              </w:rPr>
-              <w:t xml:space="preserve"/>
-            </w:r>
-          </w:p>
-        </w:tc>
-        <w:tc>
-          <w:tcPr>
-            <w:tcW w:type="dxa" w:w="700"/>
-            <w:tcBorders>
-              <w:top w:val="single" w:color="D4D0C5" w:sz="4"/>
-              <w:left w:val="none" w:color="FFFFFF" w:sz="0"/>
-              <w:bottom w:val="none" w:color="FFFFFF" w:sz="0"/>
-              <w:right w:val="none" w:color="FFFFFF" w:sz="0"/>
-            </w:tcBorders>
-            <w:tcMar>
-              <w:top w:type="dxa" w:w="60"/>
-              <w:left w:type="dxa" w:w="100"/>
-              <w:bottom w:type="dxa" w:w="60"/>
-              <w:right w:type="dxa" w:w="100"/>
-            </w:tcMar>
-          </w:tcPr>
-          <w:p>
-            <w:pPr>
-              <w:spacing w:after="0" w:before="0"/>
-              <w:jc w:val="center"/>
-            </w:pPr>
-            <w:r>
-              <w:rPr>
-                <w:rFonts w:ascii="Segoe UI Symbol" w:cs="Segoe UI Symbol" w:eastAsia="Segoe UI Symbol" w:hAnsi="Segoe UI Symbol"/>
-                <w:color w:val="5D534C"/>
-                <w:sz w:val="20"/>
-                <w:szCs w:val="20"/>
-              </w:rPr>
-              <w:t xml:space="preserve">☐ </w:t>
-            </w:r>
-          </w:p>
-        </w:tc>
-        <w:tc>
-          <w:tcPr>
-            <w:tcW w:type="dxa" w:w="700"/>
-            <w:tcBorders>
-              <w:top w:val="single" w:color="D4D0C5" w:sz="4"/>
-              <w:left w:val="none" w:color="FFFFFF" w:sz="0"/>
-              <w:bottom w:val="none" w:color="FFFFFF" w:sz="0"/>
-              <w:right w:val="none" w:color="FFFFFF" w:sz="0"/>
-            </w:tcBorders>
-            <w:tcMar>
-              <w:top w:type="dxa" w:w="60"/>
-              <w:left w:type="dxa" w:w="100"/>
-              <w:bottom w:type="dxa" w:w="60"/>
-              <w:right w:type="dxa" w:w="100"/>
-            </w:tcMar>
-          </w:tcPr>
-          <w:p>
-            <w:pPr>
-              <w:spacing w:after="0" w:before="0"/>
-              <w:jc w:val="center"/>
-            </w:pPr>
-            <w:r>
-              <w:rPr>
-                <w:rFonts w:ascii="Segoe UI Symbol" w:cs="Segoe UI Symbol" w:eastAsia="Segoe UI Symbol" w:hAnsi="Segoe UI Symbol"/>
-                <w:color w:val="5D534C"/>
-                <w:sz w:val="20"/>
-                <w:szCs w:val="20"/>
-              </w:rPr>
-              <w:t xml:space="preserve">☐ </w:t>
-            </w:r>
-          </w:p>
-        </w:tc>
-      </w:tr>
-      <w:tr>
-        <w:tc>
-          <w:tcPr>
-            <w:tcW w:type="dxa" w:w="8804"/>
-            <w:tcBorders>
-              <w:top w:val="single" w:color="D4D0C5" w:sz="4"/>
-              <w:left w:val="none" w:color="FFFFFF" w:sz="0"/>
-              <w:bottom w:val="none" w:color="FFFFFF" w:sz="0"/>
-              <w:right w:val="none" w:color="FFFFFF" w:sz="0"/>
-            </w:tcBorders>
-            <w:tcMar>
-              <w:top w:type="dxa" w:w="60"/>
-              <w:left w:type="dxa" w:w="0"/>
-              <w:bottom w:type="dxa" w:w="60"/>
-              <w:right w:type="dxa" w:w="100"/>
-            </w:tcMar>
-          </w:tcPr>
-          <w:p>
-            <w:pPr>
-              <w:spacing w:after="20" w:before="0"/>
-            </w:pPr>
-            <w:r>
-              <w:rPr>
-                <w:rFonts w:ascii="Arial" w:cs="Arial" w:eastAsia="Arial" w:hAnsi="Arial"/>
-                <w:color w:val="5D534C"/>
-                <w:sz w:val="18"/>
-                <w:szCs w:val="18"/>
-              </w:rPr>
-              <w:t xml:space="preserve">Nehmen Sie Medikamente gegen eine bestehende Herz-/Kreislauferkrankung?</w:t>
-            </w:r>
-          </w:p>
-          <w:p>
-            <w:pPr>
-              <w:spacing w:after="0" w:before="0"/>
-            </w:pPr>
-            <w:r>
-              <w:rPr>
-                <w:rFonts w:ascii="Arial" w:cs="Arial" w:eastAsia="Arial" w:hAnsi="Arial"/>
-                <w:color w:val="7C6E65"/>
-                <w:sz w:val="16"/>
-                <w:szCs w:val="16"/>
-              </w:rPr>
-              <w:t xml:space="preserve">Wenn ja, welche?</w:t>
-            </w:r>
-          </w:p>
-          <w:p>
-            <w:pPr>
-              <w:pBdr>
-                <w:bottom w:val="single" w:color="7C6E65" w:sz="6" w:space="1"/>
-              </w:pBdr>
-              <w:spacing w:after="40" w:before="260"/>
-            </w:pPr>
-            <w:r>
-              <w:rPr>
-                <w:rFonts w:ascii="Arial" w:cs="Arial" w:eastAsia="Arial" w:hAnsi="Arial"/>
-                <w:color w:val="5D534C"/>
-                <w:sz w:val="18"/>
-                <w:szCs w:val="18"/>
-              </w:rPr>
-              <w:t xml:space="preserve"/>
-            </w:r>
-          </w:p>
-        </w:tc>
-        <w:tc>
-          <w:tcPr>
-            <w:tcW w:type="dxa" w:w="700"/>
-            <w:tcBorders>
-              <w:top w:val="single" w:color="D4D0C5" w:sz="4"/>
-              <w:left w:val="none" w:color="FFFFFF" w:sz="0"/>
-              <w:bottom w:val="none" w:color="FFFFFF" w:sz="0"/>
-              <w:right w:val="none" w:color="FFFFFF" w:sz="0"/>
-            </w:tcBorders>
-            <w:tcMar>
-              <w:top w:type="dxa" w:w="60"/>
-              <w:left w:type="dxa" w:w="100"/>
-              <w:bottom w:type="dxa" w:w="60"/>
-              <w:right w:type="dxa" w:w="100"/>
-            </w:tcMar>
-          </w:tcPr>
-          <w:p>
-            <w:pPr>
-              <w:spacing w:after="0" w:before="0"/>
-              <w:jc w:val="center"/>
-            </w:pPr>
-            <w:r>
-              <w:rPr>
-                <w:rFonts w:ascii="Segoe UI Symbol" w:cs="Segoe UI Symbol" w:eastAsia="Segoe UI Symbol" w:hAnsi="Segoe UI Symbol"/>
-                <w:color w:val="5D534C"/>
-                <w:sz w:val="20"/>
-                <w:szCs w:val="20"/>
-              </w:rPr>
-              <w:t xml:space="preserve">☐ </w:t>
-            </w:r>
-          </w:p>
-        </w:tc>
-        <w:tc>
-          <w:tcPr>
-            <w:tcW w:type="dxa" w:w="700"/>
-            <w:tcBorders>
-              <w:top w:val="single" w:color="D4D0C5" w:sz="4"/>
-              <w:left w:val="none" w:color="FFFFFF" w:sz="0"/>
-              <w:bottom w:val="none" w:color="FFFFFF" w:sz="0"/>
-              <w:right w:val="none" w:color="FFFFFF" w:sz="0"/>
-            </w:tcBorders>
-            <w:tcMar>
-              <w:top w:type="dxa" w:w="60"/>
-              <w:left w:type="dxa" w:w="100"/>
-              <w:bottom w:type="dxa" w:w="60"/>
-              <w:right w:type="dxa" w:w="100"/>
-            </w:tcMar>
-          </w:tcPr>
-          <w:p>
-            <w:pPr>
-              <w:spacing w:after="0" w:before="0"/>
-              <w:jc w:val="center"/>
-            </w:pPr>
-            <w:r>
-              <w:rPr>
-                <w:rFonts w:ascii="Segoe UI Symbol" w:cs="Segoe UI Symbol" w:eastAsia="Segoe UI Symbol" w:hAnsi="Segoe UI Symbol"/>
-                <w:color w:val="5D534C"/>
-                <w:sz w:val="20"/>
-                <w:szCs w:val="20"/>
-              </w:rPr>
-              <w:t xml:space="preserve">☐ </w:t>
-            </w:r>
-          </w:p>
-        </w:tc>
-      </w:tr>
-      <w:tr>
-        <w:tc>
-          <w:tcPr>
-            <w:tcW w:type="dxa" w:w="8804"/>
-            <w:tcBorders>
-              <w:top w:val="single" w:color="D4D0C5" w:sz="4"/>
-              <w:left w:val="none" w:color="FFFFFF" w:sz="0"/>
-              <w:bottom w:val="none" w:color="FFFFFF" w:sz="0"/>
-              <w:right w:val="none" w:color="FFFFFF" w:sz="0"/>
-            </w:tcBorders>
-            <w:tcMar>
-              <w:top w:type="dxa" w:w="60"/>
-              <w:left w:type="dxa" w:w="0"/>
-              <w:bottom w:type="dxa" w:w="60"/>
-              <w:right w:type="dxa" w:w="100"/>
-            </w:tcMar>
-          </w:tcPr>
-          <w:p>
-            <w:pPr>
-              <w:spacing w:after="0" w:before="0"/>
-            </w:pPr>
-            <w:r>
-              <w:rPr>
-                <w:rFonts w:ascii="Arial" w:cs="Arial" w:eastAsia="Arial" w:hAnsi="Arial"/>
-                <w:color w:val="5D534C"/>
-                <w:sz w:val="18"/>
-                <w:szCs w:val="18"/>
-              </w:rPr>
-              <w:t xml:space="preserve">Besteht bei Ihnen eine Infektionskrankheit (HIV, Hepatitis o. ä.)?</w:t>
-            </w:r>
-          </w:p>
-        </w:tc>
-        <w:tc>
-          <w:tcPr>
-            <w:tcW w:type="dxa" w:w="700"/>
-            <w:tcBorders>
-              <w:top w:val="single" w:color="D4D0C5" w:sz="4"/>
-              <w:left w:val="none" w:color="FFFFFF" w:sz="0"/>
-              <w:bottom w:val="none" w:color="FFFFFF" w:sz="0"/>
-              <w:right w:val="none" w:color="FFFFFF" w:sz="0"/>
-            </w:tcBorders>
-            <w:tcMar>
-              <w:top w:type="dxa" w:w="60"/>
-              <w:left w:type="dxa" w:w="100"/>
-              <w:bottom w:type="dxa" w:w="60"/>
-              <w:right w:type="dxa" w:w="100"/>
-            </w:tcMar>
-          </w:tcPr>
-          <w:p>
-            <w:pPr>
-              <w:spacing w:after="0" w:before="0"/>
-              <w:jc w:val="center"/>
-            </w:pPr>
-            <w:r>
-              <w:rPr>
-                <w:rFonts w:ascii="Segoe UI Symbol" w:cs="Segoe UI Symbol" w:eastAsia="Segoe UI Symbol" w:hAnsi="Segoe UI Symbol"/>
-                <w:color w:val="5D534C"/>
-                <w:sz w:val="20"/>
-                <w:szCs w:val="20"/>
-              </w:rPr>
-              <w:t xml:space="preserve">☐ </w:t>
-            </w:r>
-          </w:p>
-        </w:tc>
-        <w:tc>
-          <w:tcPr>
-            <w:tcW w:type="dxa" w:w="700"/>
-            <w:tcBorders>
-              <w:top w:val="single" w:color="D4D0C5" w:sz="4"/>
-              <w:left w:val="none" w:color="FFFFFF" w:sz="0"/>
-              <w:bottom w:val="none" w:color="FFFFFF" w:sz="0"/>
-              <w:right w:val="none" w:color="FFFFFF" w:sz="0"/>
-            </w:tcBorders>
-            <w:tcMar>
-              <w:top w:type="dxa" w:w="60"/>
-              <w:left w:type="dxa" w:w="100"/>
-              <w:bottom w:type="dxa" w:w="60"/>
-              <w:right w:type="dxa" w:w="100"/>
-            </w:tcMar>
-          </w:tcPr>
-          <w:p>
-            <w:pPr>
-              <w:spacing w:after="0" w:before="0"/>
-              <w:jc w:val="center"/>
-            </w:pPr>
-            <w:r>
-              <w:rPr>
-                <w:rFonts w:ascii="Segoe UI Symbol" w:cs="Segoe UI Symbol" w:eastAsia="Segoe UI Symbol" w:hAnsi="Segoe UI Symbol"/>
-                <w:color w:val="5D534C"/>
-                <w:sz w:val="20"/>
-                <w:szCs w:val="20"/>
-              </w:rPr>
-              <w:t xml:space="preserve">☐ </w:t>
-            </w:r>
-          </w:p>
-        </w:tc>
-      </w:tr>
-      <w:tr>
-        <w:tc>
-          <w:tcPr>
-            <w:tcW w:type="dxa" w:w="8804"/>
-            <w:tcBorders>
-              <w:top w:val="single" w:color="D4D0C5" w:sz="4"/>
-              <w:left w:val="none" w:color="FFFFFF" w:sz="0"/>
-              <w:bottom w:val="none" w:color="FFFFFF" w:sz="0"/>
-              <w:right w:val="none" w:color="FFFFFF" w:sz="0"/>
-            </w:tcBorders>
-            <w:tcMar>
-              <w:top w:type="dxa" w:w="60"/>
-              <w:left w:type="dxa" w:w="0"/>
-              <w:bottom w:type="dxa" w:w="60"/>
-              <w:right w:type="dxa" w:w="100"/>
-            </w:tcMar>
-          </w:tcPr>
-          <w:p>
-            <w:pPr>
-              <w:spacing w:after="0" w:before="0"/>
-            </w:pPr>
-            <w:r>
-              <w:rPr>
-                <w:rFonts w:ascii="Arial" w:cs="Arial" w:eastAsia="Arial" w:hAnsi="Arial"/>
-                <w:color w:val="5D534C"/>
-                <w:sz w:val="18"/>
-                <w:szCs w:val="18"/>
-              </w:rPr>
-              <w:t xml:space="preserve">Haben Sie Asthma?</w:t>
-            </w:r>
-          </w:p>
-        </w:tc>
-        <w:tc>
-          <w:tcPr>
-            <w:tcW w:type="dxa" w:w="700"/>
-            <w:tcBorders>
-              <w:top w:val="single" w:color="D4D0C5" w:sz="4"/>
-              <w:left w:val="none" w:color="FFFFFF" w:sz="0"/>
-              <w:bottom w:val="none" w:color="FFFFFF" w:sz="0"/>
-              <w:right w:val="none" w:color="FFFFFF" w:sz="0"/>
-            </w:tcBorders>
-            <w:tcMar>
-              <w:top w:type="dxa" w:w="60"/>
-              <w:left w:type="dxa" w:w="100"/>
-              <w:bottom w:type="dxa" w:w="60"/>
-              <w:right w:type="dxa" w:w="100"/>
-            </w:tcMar>
-          </w:tcPr>
-          <w:p>
-            <w:pPr>
-              <w:spacing w:after="0" w:before="0"/>
-              <w:jc w:val="center"/>
-            </w:pPr>
-            <w:r>
-              <w:rPr>
-                <w:rFonts w:ascii="Segoe UI Symbol" w:cs="Segoe UI Symbol" w:eastAsia="Segoe UI Symbol" w:hAnsi="Segoe UI Symbol"/>
-                <w:color w:val="5D534C"/>
-                <w:sz w:val="20"/>
-                <w:szCs w:val="20"/>
-              </w:rPr>
-              <w:t xml:space="preserve">☐ </w:t>
-            </w:r>
-          </w:p>
-        </w:tc>
-        <w:tc>
-          <w:tcPr>
-            <w:tcW w:type="dxa" w:w="700"/>
-            <w:tcBorders>
-              <w:top w:val="single" w:color="D4D0C5" w:sz="4"/>
-              <w:left w:val="none" w:color="FFFFFF" w:sz="0"/>
-              <w:bottom w:val="none" w:color="FFFFFF" w:sz="0"/>
-              <w:right w:val="none" w:color="FFFFFF" w:sz="0"/>
-            </w:tcBorders>
-            <w:tcMar>
-              <w:top w:type="dxa" w:w="60"/>
-              <w:left w:type="dxa" w:w="100"/>
-              <w:bottom w:type="dxa" w:w="60"/>
-              <w:right w:type="dxa" w:w="100"/>
-            </w:tcMar>
-          </w:tcPr>
-          <w:p>
-            <w:pPr>
-              <w:spacing w:after="0" w:before="0"/>
-              <w:jc w:val="center"/>
-            </w:pPr>
-            <w:r>
-              <w:rPr>
-                <w:rFonts w:ascii="Segoe UI Symbol" w:cs="Segoe UI Symbol" w:eastAsia="Segoe UI Symbol" w:hAnsi="Segoe UI Symbol"/>
-                <w:color w:val="5D534C"/>
-                <w:sz w:val="20"/>
-                <w:szCs w:val="20"/>
-              </w:rPr>
-              <w:t xml:space="preserve">☐ </w:t>
-            </w:r>
-          </w:p>
-        </w:tc>
-      </w:tr>
-    </w:tbl>
+    <w:p>
+      <w:pPr>
+        <w:pBdr>
+          <w:left w:val="single" w:color="007AA8" w:sz="18" w:space="6"/>
+        </w:pBdr>
+        <w:shd w:fill="ECEAE5" w:color="auto" w:val="clear"/>
+        <w:spacing w:after="100" w:before="0" w:line="280"/>
+        <w:ind w:left="120" w:right="120"/>
+      </w:pPr>
+      <w:r>
+        <w:rPr>
+          <w:rFonts w:ascii="Arial" w:cs="Arial" w:eastAsia="Arial" w:hAnsi="Arial"/>
+          <w:b/>
+          <w:bCs/>
+          <w:color w:val="5D534C"/>
+          <w:sz w:val="18"/>
+          <w:szCs w:val="18"/>
+        </w:rPr>
+        <w:t xml:space="preserve">Medikament zur Senkung der Herzfrequenz (Betablocker, z. B. Metoprolol): </w:t>
+      </w:r>
+      <w:r>
+        <w:rPr>
+          <w:rFonts w:ascii="Arial" w:cs="Arial" w:eastAsia="Arial" w:hAnsi="Arial"/>
+          <w:color w:val="5D534C"/>
+          <w:sz w:val="18"/>
+          <w:szCs w:val="18"/>
+        </w:rPr>
+        <w:t xml:space="preserve">Scharfe Bilder des Herzens gelingen nur bei ruhigem, langsamem Herzschlag. Deshalb erhalten Sie in der Regel vorab und bei Bedarf vor Ort einen Betablocker. Mögliche Nebenwirkungen sind Müdigkeit, Schwindel, ein niedriger Blutdruck oder ein sehr langsamer Puls; bei Asthma kann Atemnot auftreten.</w:t>
+      </w:r>
+    </w:p>
+    <w:p>
+      <w:pPr>
+        <w:pBdr>
+          <w:left w:val="single" w:color="E2574C" w:sz="18" w:space="6"/>
+        </w:pBdr>
+        <w:shd w:fill="ECEAE5" w:color="auto" w:val="clear"/>
+        <w:spacing w:after="100" w:before="0" w:line="280"/>
+        <w:ind w:left="120" w:right="120"/>
+      </w:pPr>
+      <w:r>
+        <w:rPr>
+          <w:rFonts w:ascii="Arial" w:cs="Arial" w:eastAsia="Arial" w:hAnsi="Arial"/>
+          <w:b/>
+          <w:bCs/>
+          <w:color w:val="5D534C"/>
+          <w:sz w:val="18"/>
+          <w:szCs w:val="18"/>
+        </w:rPr>
+        <w:t xml:space="preserve">Nitrospray: </w:t>
+      </w:r>
+      <w:r>
+        <w:rPr>
+          <w:rFonts w:ascii="Arial" w:cs="Arial" w:eastAsia="Arial" w:hAnsi="Arial"/>
+          <w:color w:val="5D534C"/>
+          <w:sz w:val="18"/>
+          <w:szCs w:val="18"/>
+        </w:rPr>
+        <w:t xml:space="preserve">Kurz vor der Aufnahme erhalten Sie meist einen Hub Nitrospray unter die Zunge. Er erweitert die Herzkranzgefäße. Häufig sind vorübergehende Kopfschmerzen, Wärmegefühl oder Schwindel durch einen Blutdruckabfall. Nach Einnahme eines Potenzmittels (z. B. Sildenafil, Tadalafil) in den letzten 48 Stunden darf kein Nitrospray gegeben werden.</w:t>
+      </w:r>
+    </w:p>
+    <w:p>
+      <w:pPr>
+        <w:pBdr>
+          <w:left w:val="single" w:color="008B92" w:sz="18" w:space="6"/>
+        </w:pBdr>
+        <w:shd w:fill="ECEAE5" w:color="auto" w:val="clear"/>
+        <w:spacing w:after="100" w:before="0" w:line="280"/>
+        <w:ind w:left="120" w:right="120"/>
+      </w:pPr>
+      <w:r>
+        <w:rPr>
+          <w:rFonts w:ascii="Arial" w:cs="Arial" w:eastAsia="Arial" w:hAnsi="Arial"/>
+          <w:b/>
+          <w:bCs/>
+          <w:color w:val="5D534C"/>
+          <w:sz w:val="18"/>
+          <w:szCs w:val="18"/>
+        </w:rPr>
+        <w:t xml:space="preserve">Kontrastmittel, Niere und Schilddrüse: </w:t>
+      </w:r>
+      <w:r>
+        <w:rPr>
+          <w:rFonts w:ascii="Arial" w:cs="Arial" w:eastAsia="Arial" w:hAnsi="Arial"/>
+          <w:color w:val="5D534C"/>
+          <w:sz w:val="18"/>
+          <w:szCs w:val="18"/>
+        </w:rPr>
+        <w:t xml:space="preserve">Bei eingeschränkter Nierenfunktion kann das jodhaltige Kontrastmittel die Nieren belasten, bei einer Schilddrüsenüberfunktion kann es diese auslösen oder verstärken. Deshalb benötigen wir aktuelle Werte von Kreatinin und TSH.</w:t>
+      </w:r>
+    </w:p>
+    <w:p>
+      <w:pPr>
+        <w:pBdr>
+          <w:left w:val="single" w:color="68B1D4" w:sz="18" w:space="6"/>
+        </w:pBdr>
+        <w:shd w:fill="ECEAE5" w:color="auto" w:val="clear"/>
+        <w:spacing w:after="100" w:before="0" w:line="280"/>
+        <w:ind w:left="120" w:right="120"/>
+      </w:pPr>
+      <w:r>
+        <w:rPr>
+          <w:rFonts w:ascii="Arial" w:cs="Arial" w:eastAsia="Arial" w:hAnsi="Arial"/>
+          <w:b/>
+          <w:bCs/>
+          <w:color w:val="5D534C"/>
+          <w:sz w:val="18"/>
+          <w:szCs w:val="18"/>
+        </w:rPr>
+        <w:t xml:space="preserve">Strahlung: </w:t>
+      </w:r>
+      <w:r>
+        <w:rPr>
+          <w:rFonts w:ascii="Arial" w:cs="Arial" w:eastAsia="Arial" w:hAnsi="Arial"/>
+          <w:color w:val="5D534C"/>
+          <w:sz w:val="18"/>
+          <w:szCs w:val="18"/>
+        </w:rPr>
+        <w:t xml:space="preserve">Die Untersuchung arbeitet mit Röntgenstrahlung. Mit moderner Technik liegt die Dosis eines Herz-CT meist unter 5 Millisievert (zum Vergleich: natürliche Strahlung in Deutschland ca. 2,5 Millisievert pro Jahr). Sie wird nur durchgeführt, wenn der erwartete Nutzen überwiegt.</w:t>
+      </w:r>
+    </w:p>
+    <w:p>
+      <w:pPr>
+        <w:pBdr>
+          <w:left w:val="single" w:color="7C6E65" w:sz="18" w:space="6"/>
+        </w:pBdr>
+        <w:shd w:fill="ECEAE5" w:color="auto" w:val="clear"/>
+        <w:spacing w:after="100" w:before="0" w:line="280"/>
+        <w:ind w:left="120" w:right="120"/>
+      </w:pPr>
+      <w:r>
+        <w:rPr>
+          <w:rFonts w:ascii="Arial" w:cs="Arial" w:eastAsia="Arial" w:hAnsi="Arial"/>
+          <w:b/>
+          <w:bCs/>
+          <w:color w:val="5D534C"/>
+          <w:sz w:val="18"/>
+          <w:szCs w:val="18"/>
+        </w:rPr>
+        <w:t xml:space="preserve">Nach der Untersuchung: </w:t>
+      </w:r>
+      <w:r>
+        <w:rPr>
+          <w:rFonts w:ascii="Arial" w:cs="Arial" w:eastAsia="Arial" w:hAnsi="Arial"/>
+          <w:color w:val="5D534C"/>
+          <w:sz w:val="18"/>
+          <w:szCs w:val="18"/>
+        </w:rPr>
+        <w:t xml:space="preserve">Betablocker und Nitrospray können Ihre Reaktionsfähigkeit vorübergehend einschränken. Bitte fahren Sie am Untersuchungstag nicht selbst Auto und kommen Sie nicht mit dem eigenen Fahrzeug.</w:t>
+      </w:r>
+    </w:p>
     <w:p>
       <w:r>
         <w:br w:type="page"/>
@@ -1707,6 +769,1234 @@
           <w:szCs w:val="18"/>
           <w:shd w:fill="007AA8" w:color="auto" w:val="clear"/>
         </w:rPr>
+        <w:t xml:space="preserve"> 1 </w:t>
+      </w:r>
+      <w:r>
+        <w:rPr>
+          <w:rFonts w:ascii="Arial" w:cs="Arial" w:eastAsia="Arial" w:hAnsi="Arial"/>
+          <w:color w:val="5D534C"/>
+          <w:sz w:val="18"/>
+          <w:szCs w:val="18"/>
+        </w:rPr>
+        <w:t xml:space="preserve">  </w:t>
+      </w:r>
+      <w:r>
+        <w:rPr>
+          <w:rFonts w:ascii="Arial" w:cs="Arial" w:eastAsia="Arial" w:hAnsi="Arial"/>
+          <w:b/>
+          <w:bCs/>
+          <w:caps/>
+          <w:color w:val="5D534C"/>
+          <w:spacing w:val="10"/>
+          <w:sz w:val="20"/>
+          <w:szCs w:val="20"/>
+        </w:rPr>
+        <w:t xml:space="preserve">Bitte beantworten Sie uns vor der Untersuchung folgende Fragen</w:t>
+      </w:r>
+    </w:p>
+    <w:tbl>
+      <w:tblPr>
+        <w:tblW w:type="dxa" w:w="10204"/>
+        <w:tblBorders>
+          <w:top w:val="none" w:color="FFFFFF" w:sz="0"/>
+          <w:left w:val="none" w:color="FFFFFF" w:sz="0"/>
+          <w:bottom w:val="none" w:color="FFFFFF" w:sz="0"/>
+          <w:right w:val="none" w:color="FFFFFF" w:sz="0"/>
+          <w:insideH w:val="none" w:color="FFFFFF" w:sz="0"/>
+          <w:insideV w:val="none" w:color="FFFFFF" w:sz="0"/>
+        </w:tblBorders>
+        <w:tblLayout w:type="fixed"/>
+      </w:tblPr>
+      <w:tblGrid>
+        <w:gridCol w:w="8804"/>
+        <w:gridCol w:w="700"/>
+        <w:gridCol w:w="700"/>
+      </w:tblGrid>
+      <w:tr>
+        <w:tc>
+          <w:tcPr>
+            <w:tcW w:type="dxa" w:w="8804"/>
+            <w:tcBorders>
+              <w:top w:val="none" w:color="FFFFFF" w:sz="0"/>
+              <w:left w:val="none" w:color="FFFFFF" w:sz="0"/>
+              <w:bottom w:val="none" w:color="FFFFFF" w:sz="0"/>
+              <w:right w:val="none" w:color="FFFFFF" w:sz="0"/>
+            </w:tcBorders>
+            <w:tcMar>
+              <w:top w:type="dxa" w:w="60"/>
+              <w:left w:type="dxa" w:w="100"/>
+              <w:bottom w:type="dxa" w:w="60"/>
+              <w:right w:type="dxa" w:w="100"/>
+            </w:tcMar>
+          </w:tcPr>
+          <w:p>
+            <w:pPr>
+              <w:spacing w:after="60" w:before="0"/>
+            </w:pPr>
+            <w:r>
+              <w:rPr>
+                <w:rFonts w:ascii="Arial" w:cs="Arial" w:eastAsia="Arial" w:hAnsi="Arial"/>
+                <w:color w:val="5D534C"/>
+                <w:sz w:val="18"/>
+                <w:szCs w:val="18"/>
+              </w:rPr>
+              <w:t xml:space="preserve"/>
+            </w:r>
+          </w:p>
+        </w:tc>
+        <w:tc>
+          <w:tcPr>
+            <w:tcW w:type="dxa" w:w="700"/>
+            <w:tcBorders>
+              <w:top w:val="none" w:color="FFFFFF" w:sz="0"/>
+              <w:left w:val="none" w:color="FFFFFF" w:sz="0"/>
+              <w:bottom w:val="none" w:color="FFFFFF" w:sz="0"/>
+              <w:right w:val="none" w:color="FFFFFF" w:sz="0"/>
+            </w:tcBorders>
+            <w:tcMar>
+              <w:top w:type="dxa" w:w="60"/>
+              <w:left w:type="dxa" w:w="100"/>
+              <w:bottom w:type="dxa" w:w="60"/>
+              <w:right w:type="dxa" w:w="100"/>
+            </w:tcMar>
+          </w:tcPr>
+          <w:p>
+            <w:pPr>
+              <w:spacing w:after="0" w:before="0"/>
+              <w:jc w:val="center"/>
+            </w:pPr>
+            <w:r>
+              <w:rPr>
+                <w:rFonts w:ascii="Arial" w:cs="Arial" w:eastAsia="Arial" w:hAnsi="Arial"/>
+                <w:b/>
+                <w:bCs/>
+                <w:caps/>
+                <w:color w:val="7C6E65"/>
+                <w:sz w:val="14"/>
+                <w:szCs w:val="14"/>
+              </w:rPr>
+              <w:t xml:space="preserve">nein</w:t>
+            </w:r>
+          </w:p>
+        </w:tc>
+        <w:tc>
+          <w:tcPr>
+            <w:tcW w:type="dxa" w:w="700"/>
+            <w:tcBorders>
+              <w:top w:val="none" w:color="FFFFFF" w:sz="0"/>
+              <w:left w:val="none" w:color="FFFFFF" w:sz="0"/>
+              <w:bottom w:val="none" w:color="FFFFFF" w:sz="0"/>
+              <w:right w:val="none" w:color="FFFFFF" w:sz="0"/>
+            </w:tcBorders>
+            <w:tcMar>
+              <w:top w:type="dxa" w:w="60"/>
+              <w:left w:type="dxa" w:w="100"/>
+              <w:bottom w:type="dxa" w:w="60"/>
+              <w:right w:type="dxa" w:w="100"/>
+            </w:tcMar>
+          </w:tcPr>
+          <w:p>
+            <w:pPr>
+              <w:spacing w:after="0" w:before="0"/>
+              <w:jc w:val="center"/>
+            </w:pPr>
+            <w:r>
+              <w:rPr>
+                <w:rFonts w:ascii="Arial" w:cs="Arial" w:eastAsia="Arial" w:hAnsi="Arial"/>
+                <w:b/>
+                <w:bCs/>
+                <w:caps/>
+                <w:color w:val="7C6E65"/>
+                <w:sz w:val="14"/>
+                <w:szCs w:val="14"/>
+              </w:rPr>
+              <w:t xml:space="preserve">ja</w:t>
+            </w:r>
+          </w:p>
+        </w:tc>
+      </w:tr>
+      <w:tr>
+        <w:tc>
+          <w:tcPr>
+            <w:tcW w:type="dxa" w:w="8804"/>
+            <w:tcBorders>
+              <w:top w:val="single" w:color="D4D0C5" w:sz="4"/>
+              <w:left w:val="none" w:color="FFFFFF" w:sz="0"/>
+              <w:bottom w:val="none" w:color="FFFFFF" w:sz="0"/>
+              <w:right w:val="none" w:color="FFFFFF" w:sz="0"/>
+            </w:tcBorders>
+            <w:tcMar>
+              <w:top w:type="dxa" w:w="60"/>
+              <w:left w:type="dxa" w:w="0"/>
+              <w:bottom w:type="dxa" w:w="60"/>
+              <w:right w:type="dxa" w:w="100"/>
+            </w:tcMar>
+          </w:tcPr>
+          <w:p>
+            <w:pPr>
+              <w:spacing w:after="0" w:before="0"/>
+            </w:pPr>
+            <w:r>
+              <w:rPr>
+                <w:rFonts w:ascii="Arial" w:cs="Arial" w:eastAsia="Arial" w:hAnsi="Arial"/>
+                <w:color w:val="5D534C"/>
+                <w:sz w:val="18"/>
+                <w:szCs w:val="18"/>
+              </w:rPr>
+              <w:t xml:space="preserve">Haben Sie eine Nierenerkrankung?</w:t>
+            </w:r>
+          </w:p>
+        </w:tc>
+        <w:tc>
+          <w:tcPr>
+            <w:tcW w:type="dxa" w:w="700"/>
+            <w:tcBorders>
+              <w:top w:val="single" w:color="D4D0C5" w:sz="4"/>
+              <w:left w:val="none" w:color="FFFFFF" w:sz="0"/>
+              <w:bottom w:val="none" w:color="FFFFFF" w:sz="0"/>
+              <w:right w:val="none" w:color="FFFFFF" w:sz="0"/>
+            </w:tcBorders>
+            <w:tcMar>
+              <w:top w:type="dxa" w:w="60"/>
+              <w:left w:type="dxa" w:w="100"/>
+              <w:bottom w:type="dxa" w:w="60"/>
+              <w:right w:type="dxa" w:w="100"/>
+            </w:tcMar>
+          </w:tcPr>
+          <w:p>
+            <w:pPr>
+              <w:spacing w:after="0" w:before="0"/>
+              <w:jc w:val="center"/>
+            </w:pPr>
+            <w:r>
+              <w:rPr>
+                <w:rFonts w:ascii="Segoe UI Symbol" w:cs="Segoe UI Symbol" w:eastAsia="Segoe UI Symbol" w:hAnsi="Segoe UI Symbol"/>
+                <w:color w:val="5D534C"/>
+                <w:sz w:val="20"/>
+                <w:szCs w:val="20"/>
+              </w:rPr>
+              <w:t xml:space="preserve">☐ </w:t>
+            </w:r>
+          </w:p>
+        </w:tc>
+        <w:tc>
+          <w:tcPr>
+            <w:tcW w:type="dxa" w:w="700"/>
+            <w:tcBorders>
+              <w:top w:val="single" w:color="D4D0C5" w:sz="4"/>
+              <w:left w:val="none" w:color="FFFFFF" w:sz="0"/>
+              <w:bottom w:val="none" w:color="FFFFFF" w:sz="0"/>
+              <w:right w:val="none" w:color="FFFFFF" w:sz="0"/>
+            </w:tcBorders>
+            <w:tcMar>
+              <w:top w:type="dxa" w:w="60"/>
+              <w:left w:type="dxa" w:w="100"/>
+              <w:bottom w:type="dxa" w:w="60"/>
+              <w:right w:type="dxa" w:w="100"/>
+            </w:tcMar>
+          </w:tcPr>
+          <w:p>
+            <w:pPr>
+              <w:spacing w:after="0" w:before="0"/>
+              <w:jc w:val="center"/>
+            </w:pPr>
+            <w:r>
+              <w:rPr>
+                <w:rFonts w:ascii="Segoe UI Symbol" w:cs="Segoe UI Symbol" w:eastAsia="Segoe UI Symbol" w:hAnsi="Segoe UI Symbol"/>
+                <w:color w:val="5D534C"/>
+                <w:sz w:val="20"/>
+                <w:szCs w:val="20"/>
+              </w:rPr>
+              <w:t xml:space="preserve">☐ </w:t>
+            </w:r>
+          </w:p>
+        </w:tc>
+      </w:tr>
+      <w:tr>
+        <w:tc>
+          <w:tcPr>
+            <w:tcW w:type="dxa" w:w="8804"/>
+            <w:tcBorders>
+              <w:top w:val="single" w:color="D4D0C5" w:sz="4"/>
+              <w:left w:val="none" w:color="FFFFFF" w:sz="0"/>
+              <w:bottom w:val="none" w:color="FFFFFF" w:sz="0"/>
+              <w:right w:val="none" w:color="FFFFFF" w:sz="0"/>
+            </w:tcBorders>
+            <w:tcMar>
+              <w:top w:type="dxa" w:w="60"/>
+              <w:left w:type="dxa" w:w="0"/>
+              <w:bottom w:type="dxa" w:w="60"/>
+              <w:right w:type="dxa" w:w="100"/>
+            </w:tcMar>
+          </w:tcPr>
+          <w:p>
+            <w:pPr>
+              <w:spacing w:after="0" w:before="0"/>
+            </w:pPr>
+            <w:r>
+              <w:rPr>
+                <w:rFonts w:ascii="Arial" w:cs="Arial" w:eastAsia="Arial" w:hAnsi="Arial"/>
+                <w:color w:val="5D534C"/>
+                <w:sz w:val="18"/>
+                <w:szCs w:val="18"/>
+              </w:rPr>
+              <w:t xml:space="preserve">Ist eine Überfunktion der Schilddrüse bekannt?</w:t>
+            </w:r>
+          </w:p>
+        </w:tc>
+        <w:tc>
+          <w:tcPr>
+            <w:tcW w:type="dxa" w:w="700"/>
+            <w:tcBorders>
+              <w:top w:val="single" w:color="D4D0C5" w:sz="4"/>
+              <w:left w:val="none" w:color="FFFFFF" w:sz="0"/>
+              <w:bottom w:val="none" w:color="FFFFFF" w:sz="0"/>
+              <w:right w:val="none" w:color="FFFFFF" w:sz="0"/>
+            </w:tcBorders>
+            <w:tcMar>
+              <w:top w:type="dxa" w:w="60"/>
+              <w:left w:type="dxa" w:w="100"/>
+              <w:bottom w:type="dxa" w:w="60"/>
+              <w:right w:type="dxa" w:w="100"/>
+            </w:tcMar>
+          </w:tcPr>
+          <w:p>
+            <w:pPr>
+              <w:spacing w:after="0" w:before="0"/>
+              <w:jc w:val="center"/>
+            </w:pPr>
+            <w:r>
+              <w:rPr>
+                <w:rFonts w:ascii="Segoe UI Symbol" w:cs="Segoe UI Symbol" w:eastAsia="Segoe UI Symbol" w:hAnsi="Segoe UI Symbol"/>
+                <w:color w:val="5D534C"/>
+                <w:sz w:val="20"/>
+                <w:szCs w:val="20"/>
+              </w:rPr>
+              <w:t xml:space="preserve">☐ </w:t>
+            </w:r>
+          </w:p>
+        </w:tc>
+        <w:tc>
+          <w:tcPr>
+            <w:tcW w:type="dxa" w:w="700"/>
+            <w:tcBorders>
+              <w:top w:val="single" w:color="D4D0C5" w:sz="4"/>
+              <w:left w:val="none" w:color="FFFFFF" w:sz="0"/>
+              <w:bottom w:val="none" w:color="FFFFFF" w:sz="0"/>
+              <w:right w:val="none" w:color="FFFFFF" w:sz="0"/>
+            </w:tcBorders>
+            <w:tcMar>
+              <w:top w:type="dxa" w:w="60"/>
+              <w:left w:type="dxa" w:w="100"/>
+              <w:bottom w:type="dxa" w:w="60"/>
+              <w:right w:type="dxa" w:w="100"/>
+            </w:tcMar>
+          </w:tcPr>
+          <w:p>
+            <w:pPr>
+              <w:spacing w:after="0" w:before="0"/>
+              <w:jc w:val="center"/>
+            </w:pPr>
+            <w:r>
+              <w:rPr>
+                <w:rFonts w:ascii="Segoe UI Symbol" w:cs="Segoe UI Symbol" w:eastAsia="Segoe UI Symbol" w:hAnsi="Segoe UI Symbol"/>
+                <w:color w:val="5D534C"/>
+                <w:sz w:val="20"/>
+                <w:szCs w:val="20"/>
+              </w:rPr>
+              <w:t xml:space="preserve">☐ </w:t>
+            </w:r>
+          </w:p>
+        </w:tc>
+      </w:tr>
+      <w:tr>
+        <w:tc>
+          <w:tcPr>
+            <w:tcW w:type="dxa" w:w="8804"/>
+            <w:tcBorders>
+              <w:top w:val="single" w:color="D4D0C5" w:sz="4"/>
+              <w:left w:val="none" w:color="FFFFFF" w:sz="0"/>
+              <w:bottom w:val="none" w:color="FFFFFF" w:sz="0"/>
+              <w:right w:val="none" w:color="FFFFFF" w:sz="0"/>
+            </w:tcBorders>
+            <w:tcMar>
+              <w:top w:type="dxa" w:w="60"/>
+              <w:left w:type="dxa" w:w="0"/>
+              <w:bottom w:type="dxa" w:w="60"/>
+              <w:right w:type="dxa" w:w="100"/>
+            </w:tcMar>
+          </w:tcPr>
+          <w:p>
+            <w:pPr>
+              <w:spacing w:after="0" w:before="0"/>
+            </w:pPr>
+            <w:r>
+              <w:rPr>
+                <w:rFonts w:ascii="Arial" w:cs="Arial" w:eastAsia="Arial" w:hAnsi="Arial"/>
+                <w:color w:val="5D534C"/>
+                <w:sz w:val="18"/>
+                <w:szCs w:val="18"/>
+              </w:rPr>
+              <w:t xml:space="preserve">Haben Sie eine Kontrastmittelallergie oder Medikamentenallergie?</w:t>
+            </w:r>
+          </w:p>
+        </w:tc>
+        <w:tc>
+          <w:tcPr>
+            <w:tcW w:type="dxa" w:w="700"/>
+            <w:tcBorders>
+              <w:top w:val="single" w:color="D4D0C5" w:sz="4"/>
+              <w:left w:val="none" w:color="FFFFFF" w:sz="0"/>
+              <w:bottom w:val="none" w:color="FFFFFF" w:sz="0"/>
+              <w:right w:val="none" w:color="FFFFFF" w:sz="0"/>
+            </w:tcBorders>
+            <w:tcMar>
+              <w:top w:type="dxa" w:w="60"/>
+              <w:left w:type="dxa" w:w="100"/>
+              <w:bottom w:type="dxa" w:w="60"/>
+              <w:right w:type="dxa" w:w="100"/>
+            </w:tcMar>
+          </w:tcPr>
+          <w:p>
+            <w:pPr>
+              <w:spacing w:after="0" w:before="0"/>
+              <w:jc w:val="center"/>
+            </w:pPr>
+            <w:r>
+              <w:rPr>
+                <w:rFonts w:ascii="Segoe UI Symbol" w:cs="Segoe UI Symbol" w:eastAsia="Segoe UI Symbol" w:hAnsi="Segoe UI Symbol"/>
+                <w:color w:val="5D534C"/>
+                <w:sz w:val="20"/>
+                <w:szCs w:val="20"/>
+              </w:rPr>
+              <w:t xml:space="preserve">☐ </w:t>
+            </w:r>
+          </w:p>
+        </w:tc>
+        <w:tc>
+          <w:tcPr>
+            <w:tcW w:type="dxa" w:w="700"/>
+            <w:tcBorders>
+              <w:top w:val="single" w:color="D4D0C5" w:sz="4"/>
+              <w:left w:val="none" w:color="FFFFFF" w:sz="0"/>
+              <w:bottom w:val="none" w:color="FFFFFF" w:sz="0"/>
+              <w:right w:val="none" w:color="FFFFFF" w:sz="0"/>
+            </w:tcBorders>
+            <w:tcMar>
+              <w:top w:type="dxa" w:w="60"/>
+              <w:left w:type="dxa" w:w="100"/>
+              <w:bottom w:type="dxa" w:w="60"/>
+              <w:right w:type="dxa" w:w="100"/>
+            </w:tcMar>
+          </w:tcPr>
+          <w:p>
+            <w:pPr>
+              <w:spacing w:after="0" w:before="0"/>
+              <w:jc w:val="center"/>
+            </w:pPr>
+            <w:r>
+              <w:rPr>
+                <w:rFonts w:ascii="Segoe UI Symbol" w:cs="Segoe UI Symbol" w:eastAsia="Segoe UI Symbol" w:hAnsi="Segoe UI Symbol"/>
+                <w:color w:val="5D534C"/>
+                <w:sz w:val="20"/>
+                <w:szCs w:val="20"/>
+              </w:rPr>
+              <w:t xml:space="preserve">☐ </w:t>
+            </w:r>
+          </w:p>
+        </w:tc>
+      </w:tr>
+      <w:tr>
+        <w:tc>
+          <w:tcPr>
+            <w:tcW w:type="dxa" w:w="8804"/>
+            <w:tcBorders>
+              <w:top w:val="single" w:color="D4D0C5" w:sz="4"/>
+              <w:left w:val="none" w:color="FFFFFF" w:sz="0"/>
+              <w:bottom w:val="none" w:color="FFFFFF" w:sz="0"/>
+              <w:right w:val="none" w:color="FFFFFF" w:sz="0"/>
+            </w:tcBorders>
+            <w:tcMar>
+              <w:top w:type="dxa" w:w="60"/>
+              <w:left w:type="dxa" w:w="0"/>
+              <w:bottom w:type="dxa" w:w="60"/>
+              <w:right w:type="dxa" w:w="100"/>
+            </w:tcMar>
+          </w:tcPr>
+          <w:p>
+            <w:pPr>
+              <w:spacing w:after="20" w:before="0"/>
+            </w:pPr>
+            <w:r>
+              <w:rPr>
+                <w:rFonts w:ascii="Arial" w:cs="Arial" w:eastAsia="Arial" w:hAnsi="Arial"/>
+                <w:color w:val="5D534C"/>
+                <w:sz w:val="18"/>
+                <w:szCs w:val="18"/>
+              </w:rPr>
+              <w:t xml:space="preserve">Sind Sie zuckerkrank, nehmen Sie dafür Medikamente ein?</w:t>
+            </w:r>
+          </w:p>
+          <w:p>
+            <w:pPr>
+              <w:spacing w:after="0" w:before="0"/>
+            </w:pPr>
+            <w:r>
+              <w:rPr>
+                <w:rFonts w:ascii="Arial" w:cs="Arial" w:eastAsia="Arial" w:hAnsi="Arial"/>
+                <w:color w:val="7C6E65"/>
+                <w:sz w:val="16"/>
+                <w:szCs w:val="16"/>
+              </w:rPr>
+              <w:t xml:space="preserve">Wenn ja, welche?</w:t>
+            </w:r>
+          </w:p>
+          <w:p>
+            <w:pPr>
+              <w:pBdr>
+                <w:bottom w:val="single" w:color="7C6E65" w:sz="6" w:space="1"/>
+              </w:pBdr>
+              <w:spacing w:after="40" w:before="260"/>
+            </w:pPr>
+            <w:r>
+              <w:rPr>
+                <w:rFonts w:ascii="Arial" w:cs="Arial" w:eastAsia="Arial" w:hAnsi="Arial"/>
+                <w:color w:val="5D534C"/>
+                <w:sz w:val="18"/>
+                <w:szCs w:val="18"/>
+              </w:rPr>
+              <w:t xml:space="preserve"/>
+            </w:r>
+          </w:p>
+        </w:tc>
+        <w:tc>
+          <w:tcPr>
+            <w:tcW w:type="dxa" w:w="700"/>
+            <w:tcBorders>
+              <w:top w:val="single" w:color="D4D0C5" w:sz="4"/>
+              <w:left w:val="none" w:color="FFFFFF" w:sz="0"/>
+              <w:bottom w:val="none" w:color="FFFFFF" w:sz="0"/>
+              <w:right w:val="none" w:color="FFFFFF" w:sz="0"/>
+            </w:tcBorders>
+            <w:tcMar>
+              <w:top w:type="dxa" w:w="60"/>
+              <w:left w:type="dxa" w:w="100"/>
+              <w:bottom w:type="dxa" w:w="60"/>
+              <w:right w:type="dxa" w:w="100"/>
+            </w:tcMar>
+          </w:tcPr>
+          <w:p>
+            <w:pPr>
+              <w:spacing w:after="0" w:before="0"/>
+              <w:jc w:val="center"/>
+            </w:pPr>
+            <w:r>
+              <w:rPr>
+                <w:rFonts w:ascii="Segoe UI Symbol" w:cs="Segoe UI Symbol" w:eastAsia="Segoe UI Symbol" w:hAnsi="Segoe UI Symbol"/>
+                <w:color w:val="5D534C"/>
+                <w:sz w:val="20"/>
+                <w:szCs w:val="20"/>
+              </w:rPr>
+              <w:t xml:space="preserve">☐ </w:t>
+            </w:r>
+          </w:p>
+        </w:tc>
+        <w:tc>
+          <w:tcPr>
+            <w:tcW w:type="dxa" w:w="700"/>
+            <w:tcBorders>
+              <w:top w:val="single" w:color="D4D0C5" w:sz="4"/>
+              <w:left w:val="none" w:color="FFFFFF" w:sz="0"/>
+              <w:bottom w:val="none" w:color="FFFFFF" w:sz="0"/>
+              <w:right w:val="none" w:color="FFFFFF" w:sz="0"/>
+            </w:tcBorders>
+            <w:tcMar>
+              <w:top w:type="dxa" w:w="60"/>
+              <w:left w:type="dxa" w:w="100"/>
+              <w:bottom w:type="dxa" w:w="60"/>
+              <w:right w:type="dxa" w:w="100"/>
+            </w:tcMar>
+          </w:tcPr>
+          <w:p>
+            <w:pPr>
+              <w:spacing w:after="0" w:before="0"/>
+              <w:jc w:val="center"/>
+            </w:pPr>
+            <w:r>
+              <w:rPr>
+                <w:rFonts w:ascii="Segoe UI Symbol" w:cs="Segoe UI Symbol" w:eastAsia="Segoe UI Symbol" w:hAnsi="Segoe UI Symbol"/>
+                <w:color w:val="5D534C"/>
+                <w:sz w:val="20"/>
+                <w:szCs w:val="20"/>
+              </w:rPr>
+              <w:t xml:space="preserve">☐ </w:t>
+            </w:r>
+          </w:p>
+        </w:tc>
+      </w:tr>
+      <w:tr>
+        <w:tc>
+          <w:tcPr>
+            <w:tcW w:type="dxa" w:w="8804"/>
+            <w:tcBorders>
+              <w:top w:val="single" w:color="D4D0C5" w:sz="4"/>
+              <w:left w:val="none" w:color="FFFFFF" w:sz="0"/>
+              <w:bottom w:val="none" w:color="FFFFFF" w:sz="0"/>
+              <w:right w:val="none" w:color="FFFFFF" w:sz="0"/>
+            </w:tcBorders>
+            <w:tcMar>
+              <w:top w:type="dxa" w:w="60"/>
+              <w:left w:type="dxa" w:w="0"/>
+              <w:bottom w:type="dxa" w:w="60"/>
+              <w:right w:type="dxa" w:w="100"/>
+            </w:tcMar>
+          </w:tcPr>
+          <w:p>
+            <w:pPr>
+              <w:spacing w:after="0" w:before="0"/>
+            </w:pPr>
+            <w:r>
+              <w:rPr>
+                <w:rFonts w:ascii="Arial" w:cs="Arial" w:eastAsia="Arial" w:hAnsi="Arial"/>
+                <w:color w:val="5D534C"/>
+                <w:sz w:val="18"/>
+                <w:szCs w:val="18"/>
+              </w:rPr>
+              <w:t xml:space="preserve">Könnte bei Ihnen eine Schwangerschaft vorliegen?</w:t>
+            </w:r>
+          </w:p>
+        </w:tc>
+        <w:tc>
+          <w:tcPr>
+            <w:tcW w:type="dxa" w:w="700"/>
+            <w:tcBorders>
+              <w:top w:val="single" w:color="D4D0C5" w:sz="4"/>
+              <w:left w:val="none" w:color="FFFFFF" w:sz="0"/>
+              <w:bottom w:val="none" w:color="FFFFFF" w:sz="0"/>
+              <w:right w:val="none" w:color="FFFFFF" w:sz="0"/>
+            </w:tcBorders>
+            <w:tcMar>
+              <w:top w:type="dxa" w:w="60"/>
+              <w:left w:type="dxa" w:w="100"/>
+              <w:bottom w:type="dxa" w:w="60"/>
+              <w:right w:type="dxa" w:w="100"/>
+            </w:tcMar>
+          </w:tcPr>
+          <w:p>
+            <w:pPr>
+              <w:spacing w:after="0" w:before="0"/>
+              <w:jc w:val="center"/>
+            </w:pPr>
+            <w:r>
+              <w:rPr>
+                <w:rFonts w:ascii="Segoe UI Symbol" w:cs="Segoe UI Symbol" w:eastAsia="Segoe UI Symbol" w:hAnsi="Segoe UI Symbol"/>
+                <w:color w:val="5D534C"/>
+                <w:sz w:val="20"/>
+                <w:szCs w:val="20"/>
+              </w:rPr>
+              <w:t xml:space="preserve">☐ </w:t>
+            </w:r>
+          </w:p>
+        </w:tc>
+        <w:tc>
+          <w:tcPr>
+            <w:tcW w:type="dxa" w:w="700"/>
+            <w:tcBorders>
+              <w:top w:val="single" w:color="D4D0C5" w:sz="4"/>
+              <w:left w:val="none" w:color="FFFFFF" w:sz="0"/>
+              <w:bottom w:val="none" w:color="FFFFFF" w:sz="0"/>
+              <w:right w:val="none" w:color="FFFFFF" w:sz="0"/>
+            </w:tcBorders>
+            <w:tcMar>
+              <w:top w:type="dxa" w:w="60"/>
+              <w:left w:type="dxa" w:w="100"/>
+              <w:bottom w:type="dxa" w:w="60"/>
+              <w:right w:type="dxa" w:w="100"/>
+            </w:tcMar>
+          </w:tcPr>
+          <w:p>
+            <w:pPr>
+              <w:spacing w:after="0" w:before="0"/>
+              <w:jc w:val="center"/>
+            </w:pPr>
+            <w:r>
+              <w:rPr>
+                <w:rFonts w:ascii="Segoe UI Symbol" w:cs="Segoe UI Symbol" w:eastAsia="Segoe UI Symbol" w:hAnsi="Segoe UI Symbol"/>
+                <w:color w:val="5D534C"/>
+                <w:sz w:val="20"/>
+                <w:szCs w:val="20"/>
+              </w:rPr>
+              <w:t xml:space="preserve">☐ </w:t>
+            </w:r>
+          </w:p>
+        </w:tc>
+      </w:tr>
+      <w:tr>
+        <w:tc>
+          <w:tcPr>
+            <w:tcW w:type="dxa" w:w="8804"/>
+            <w:tcBorders>
+              <w:top w:val="single" w:color="D4D0C5" w:sz="4"/>
+              <w:left w:val="none" w:color="FFFFFF" w:sz="0"/>
+              <w:bottom w:val="none" w:color="FFFFFF" w:sz="0"/>
+              <w:right w:val="none" w:color="FFFFFF" w:sz="0"/>
+            </w:tcBorders>
+            <w:tcMar>
+              <w:top w:type="dxa" w:w="60"/>
+              <w:left w:type="dxa" w:w="0"/>
+              <w:bottom w:type="dxa" w:w="60"/>
+              <w:right w:type="dxa" w:w="100"/>
+            </w:tcMar>
+          </w:tcPr>
+          <w:p>
+            <w:pPr>
+              <w:spacing w:after="20" w:before="0"/>
+            </w:pPr>
+            <w:r>
+              <w:rPr>
+                <w:rFonts w:ascii="Arial" w:cs="Arial" w:eastAsia="Arial" w:hAnsi="Arial"/>
+                <w:color w:val="5D534C"/>
+                <w:sz w:val="18"/>
+                <w:szCs w:val="18"/>
+              </w:rPr>
+              <w:t xml:space="preserve">Besteht eine Herz-/Kreislauferkrankung (z. B. koronare Herzkrankheit, Bluthochdruck)?</w:t>
+            </w:r>
+          </w:p>
+          <w:p>
+            <w:pPr>
+              <w:spacing w:after="0" w:before="0"/>
+            </w:pPr>
+            <w:r>
+              <w:rPr>
+                <w:rFonts w:ascii="Arial" w:cs="Arial" w:eastAsia="Arial" w:hAnsi="Arial"/>
+                <w:color w:val="7C6E65"/>
+                <w:sz w:val="16"/>
+                <w:szCs w:val="16"/>
+              </w:rPr>
+              <w:t xml:space="preserve">Wenn ja, bitte angeben:</w:t>
+            </w:r>
+          </w:p>
+          <w:p>
+            <w:pPr>
+              <w:pBdr>
+                <w:bottom w:val="single" w:color="7C6E65" w:sz="6" w:space="1"/>
+              </w:pBdr>
+              <w:spacing w:after="40" w:before="260"/>
+            </w:pPr>
+            <w:r>
+              <w:rPr>
+                <w:rFonts w:ascii="Arial" w:cs="Arial" w:eastAsia="Arial" w:hAnsi="Arial"/>
+                <w:color w:val="5D534C"/>
+                <w:sz w:val="18"/>
+                <w:szCs w:val="18"/>
+              </w:rPr>
+              <w:t xml:space="preserve"/>
+            </w:r>
+          </w:p>
+        </w:tc>
+        <w:tc>
+          <w:tcPr>
+            <w:tcW w:type="dxa" w:w="700"/>
+            <w:tcBorders>
+              <w:top w:val="single" w:color="D4D0C5" w:sz="4"/>
+              <w:left w:val="none" w:color="FFFFFF" w:sz="0"/>
+              <w:bottom w:val="none" w:color="FFFFFF" w:sz="0"/>
+              <w:right w:val="none" w:color="FFFFFF" w:sz="0"/>
+            </w:tcBorders>
+            <w:tcMar>
+              <w:top w:type="dxa" w:w="60"/>
+              <w:left w:type="dxa" w:w="100"/>
+              <w:bottom w:type="dxa" w:w="60"/>
+              <w:right w:type="dxa" w:w="100"/>
+            </w:tcMar>
+          </w:tcPr>
+          <w:p>
+            <w:pPr>
+              <w:spacing w:after="0" w:before="0"/>
+              <w:jc w:val="center"/>
+            </w:pPr>
+            <w:r>
+              <w:rPr>
+                <w:rFonts w:ascii="Segoe UI Symbol" w:cs="Segoe UI Symbol" w:eastAsia="Segoe UI Symbol" w:hAnsi="Segoe UI Symbol"/>
+                <w:color w:val="5D534C"/>
+                <w:sz w:val="20"/>
+                <w:szCs w:val="20"/>
+              </w:rPr>
+              <w:t xml:space="preserve">☐ </w:t>
+            </w:r>
+          </w:p>
+        </w:tc>
+        <w:tc>
+          <w:tcPr>
+            <w:tcW w:type="dxa" w:w="700"/>
+            <w:tcBorders>
+              <w:top w:val="single" w:color="D4D0C5" w:sz="4"/>
+              <w:left w:val="none" w:color="FFFFFF" w:sz="0"/>
+              <w:bottom w:val="none" w:color="FFFFFF" w:sz="0"/>
+              <w:right w:val="none" w:color="FFFFFF" w:sz="0"/>
+            </w:tcBorders>
+            <w:tcMar>
+              <w:top w:type="dxa" w:w="60"/>
+              <w:left w:type="dxa" w:w="100"/>
+              <w:bottom w:type="dxa" w:w="60"/>
+              <w:right w:type="dxa" w:w="100"/>
+            </w:tcMar>
+          </w:tcPr>
+          <w:p>
+            <w:pPr>
+              <w:spacing w:after="0" w:before="0"/>
+              <w:jc w:val="center"/>
+            </w:pPr>
+            <w:r>
+              <w:rPr>
+                <w:rFonts w:ascii="Segoe UI Symbol" w:cs="Segoe UI Symbol" w:eastAsia="Segoe UI Symbol" w:hAnsi="Segoe UI Symbol"/>
+                <w:color w:val="5D534C"/>
+                <w:sz w:val="20"/>
+                <w:szCs w:val="20"/>
+              </w:rPr>
+              <w:t xml:space="preserve">☐ </w:t>
+            </w:r>
+          </w:p>
+        </w:tc>
+      </w:tr>
+      <w:tr>
+        <w:tc>
+          <w:tcPr>
+            <w:tcW w:type="dxa" w:w="8804"/>
+            <w:tcBorders>
+              <w:top w:val="single" w:color="D4D0C5" w:sz="4"/>
+              <w:left w:val="none" w:color="FFFFFF" w:sz="0"/>
+              <w:bottom w:val="none" w:color="FFFFFF" w:sz="0"/>
+              <w:right w:val="none" w:color="FFFFFF" w:sz="0"/>
+            </w:tcBorders>
+            <w:tcMar>
+              <w:top w:type="dxa" w:w="60"/>
+              <w:left w:type="dxa" w:w="0"/>
+              <w:bottom w:type="dxa" w:w="60"/>
+              <w:right w:type="dxa" w:w="100"/>
+            </w:tcMar>
+          </w:tcPr>
+          <w:p>
+            <w:pPr>
+              <w:spacing w:after="20" w:before="0"/>
+            </w:pPr>
+            <w:r>
+              <w:rPr>
+                <w:rFonts w:ascii="Arial" w:cs="Arial" w:eastAsia="Arial" w:hAnsi="Arial"/>
+                <w:color w:val="5D534C"/>
+                <w:sz w:val="18"/>
+                <w:szCs w:val="18"/>
+              </w:rPr>
+              <w:t xml:space="preserve">Nehmen Sie Medikamente gegen eine bestehende Herz-/Kreislauferkrankung?</w:t>
+            </w:r>
+          </w:p>
+          <w:p>
+            <w:pPr>
+              <w:spacing w:after="0" w:before="0"/>
+            </w:pPr>
+            <w:r>
+              <w:rPr>
+                <w:rFonts w:ascii="Arial" w:cs="Arial" w:eastAsia="Arial" w:hAnsi="Arial"/>
+                <w:color w:val="7C6E65"/>
+                <w:sz w:val="16"/>
+                <w:szCs w:val="16"/>
+              </w:rPr>
+              <w:t xml:space="preserve">Wenn ja, welche?</w:t>
+            </w:r>
+          </w:p>
+          <w:p>
+            <w:pPr>
+              <w:pBdr>
+                <w:bottom w:val="single" w:color="7C6E65" w:sz="6" w:space="1"/>
+              </w:pBdr>
+              <w:spacing w:after="40" w:before="260"/>
+            </w:pPr>
+            <w:r>
+              <w:rPr>
+                <w:rFonts w:ascii="Arial" w:cs="Arial" w:eastAsia="Arial" w:hAnsi="Arial"/>
+                <w:color w:val="5D534C"/>
+                <w:sz w:val="18"/>
+                <w:szCs w:val="18"/>
+              </w:rPr>
+              <w:t xml:space="preserve"/>
+            </w:r>
+          </w:p>
+        </w:tc>
+        <w:tc>
+          <w:tcPr>
+            <w:tcW w:type="dxa" w:w="700"/>
+            <w:tcBorders>
+              <w:top w:val="single" w:color="D4D0C5" w:sz="4"/>
+              <w:left w:val="none" w:color="FFFFFF" w:sz="0"/>
+              <w:bottom w:val="none" w:color="FFFFFF" w:sz="0"/>
+              <w:right w:val="none" w:color="FFFFFF" w:sz="0"/>
+            </w:tcBorders>
+            <w:tcMar>
+              <w:top w:type="dxa" w:w="60"/>
+              <w:left w:type="dxa" w:w="100"/>
+              <w:bottom w:type="dxa" w:w="60"/>
+              <w:right w:type="dxa" w:w="100"/>
+            </w:tcMar>
+          </w:tcPr>
+          <w:p>
+            <w:pPr>
+              <w:spacing w:after="0" w:before="0"/>
+              <w:jc w:val="center"/>
+            </w:pPr>
+            <w:r>
+              <w:rPr>
+                <w:rFonts w:ascii="Segoe UI Symbol" w:cs="Segoe UI Symbol" w:eastAsia="Segoe UI Symbol" w:hAnsi="Segoe UI Symbol"/>
+                <w:color w:val="5D534C"/>
+                <w:sz w:val="20"/>
+                <w:szCs w:val="20"/>
+              </w:rPr>
+              <w:t xml:space="preserve">☐ </w:t>
+            </w:r>
+          </w:p>
+        </w:tc>
+        <w:tc>
+          <w:tcPr>
+            <w:tcW w:type="dxa" w:w="700"/>
+            <w:tcBorders>
+              <w:top w:val="single" w:color="D4D0C5" w:sz="4"/>
+              <w:left w:val="none" w:color="FFFFFF" w:sz="0"/>
+              <w:bottom w:val="none" w:color="FFFFFF" w:sz="0"/>
+              <w:right w:val="none" w:color="FFFFFF" w:sz="0"/>
+            </w:tcBorders>
+            <w:tcMar>
+              <w:top w:type="dxa" w:w="60"/>
+              <w:left w:type="dxa" w:w="100"/>
+              <w:bottom w:type="dxa" w:w="60"/>
+              <w:right w:type="dxa" w:w="100"/>
+            </w:tcMar>
+          </w:tcPr>
+          <w:p>
+            <w:pPr>
+              <w:spacing w:after="0" w:before="0"/>
+              <w:jc w:val="center"/>
+            </w:pPr>
+            <w:r>
+              <w:rPr>
+                <w:rFonts w:ascii="Segoe UI Symbol" w:cs="Segoe UI Symbol" w:eastAsia="Segoe UI Symbol" w:hAnsi="Segoe UI Symbol"/>
+                <w:color w:val="5D534C"/>
+                <w:sz w:val="20"/>
+                <w:szCs w:val="20"/>
+              </w:rPr>
+              <w:t xml:space="preserve">☐ </w:t>
+            </w:r>
+          </w:p>
+        </w:tc>
+      </w:tr>
+      <w:tr>
+        <w:tc>
+          <w:tcPr>
+            <w:tcW w:type="dxa" w:w="8804"/>
+            <w:tcBorders>
+              <w:top w:val="single" w:color="D4D0C5" w:sz="4"/>
+              <w:left w:val="none" w:color="FFFFFF" w:sz="0"/>
+              <w:bottom w:val="none" w:color="FFFFFF" w:sz="0"/>
+              <w:right w:val="none" w:color="FFFFFF" w:sz="0"/>
+            </w:tcBorders>
+            <w:tcMar>
+              <w:top w:type="dxa" w:w="60"/>
+              <w:left w:type="dxa" w:w="0"/>
+              <w:bottom w:type="dxa" w:w="60"/>
+              <w:right w:type="dxa" w:w="100"/>
+            </w:tcMar>
+          </w:tcPr>
+          <w:p>
+            <w:pPr>
+              <w:spacing w:after="0" w:before="0"/>
+            </w:pPr>
+            <w:r>
+              <w:rPr>
+                <w:rFonts w:ascii="Arial" w:cs="Arial" w:eastAsia="Arial" w:hAnsi="Arial"/>
+                <w:color w:val="5D534C"/>
+                <w:sz w:val="18"/>
+                <w:szCs w:val="18"/>
+              </w:rPr>
+              <w:t xml:space="preserve">Haben Sie Herzrhythmusstörungen (z. B. Vorhofflimmern) oder einen Herzschrittmacher?</w:t>
+            </w:r>
+          </w:p>
+        </w:tc>
+        <w:tc>
+          <w:tcPr>
+            <w:tcW w:type="dxa" w:w="700"/>
+            <w:tcBorders>
+              <w:top w:val="single" w:color="D4D0C5" w:sz="4"/>
+              <w:left w:val="none" w:color="FFFFFF" w:sz="0"/>
+              <w:bottom w:val="none" w:color="FFFFFF" w:sz="0"/>
+              <w:right w:val="none" w:color="FFFFFF" w:sz="0"/>
+            </w:tcBorders>
+            <w:tcMar>
+              <w:top w:type="dxa" w:w="60"/>
+              <w:left w:type="dxa" w:w="100"/>
+              <w:bottom w:type="dxa" w:w="60"/>
+              <w:right w:type="dxa" w:w="100"/>
+            </w:tcMar>
+          </w:tcPr>
+          <w:p>
+            <w:pPr>
+              <w:spacing w:after="0" w:before="0"/>
+              <w:jc w:val="center"/>
+            </w:pPr>
+            <w:r>
+              <w:rPr>
+                <w:rFonts w:ascii="Segoe UI Symbol" w:cs="Segoe UI Symbol" w:eastAsia="Segoe UI Symbol" w:hAnsi="Segoe UI Symbol"/>
+                <w:color w:val="5D534C"/>
+                <w:sz w:val="20"/>
+                <w:szCs w:val="20"/>
+              </w:rPr>
+              <w:t xml:space="preserve">☐ </w:t>
+            </w:r>
+          </w:p>
+        </w:tc>
+        <w:tc>
+          <w:tcPr>
+            <w:tcW w:type="dxa" w:w="700"/>
+            <w:tcBorders>
+              <w:top w:val="single" w:color="D4D0C5" w:sz="4"/>
+              <w:left w:val="none" w:color="FFFFFF" w:sz="0"/>
+              <w:bottom w:val="none" w:color="FFFFFF" w:sz="0"/>
+              <w:right w:val="none" w:color="FFFFFF" w:sz="0"/>
+            </w:tcBorders>
+            <w:tcMar>
+              <w:top w:type="dxa" w:w="60"/>
+              <w:left w:type="dxa" w:w="100"/>
+              <w:bottom w:type="dxa" w:w="60"/>
+              <w:right w:type="dxa" w:w="100"/>
+            </w:tcMar>
+          </w:tcPr>
+          <w:p>
+            <w:pPr>
+              <w:spacing w:after="0" w:before="0"/>
+              <w:jc w:val="center"/>
+            </w:pPr>
+            <w:r>
+              <w:rPr>
+                <w:rFonts w:ascii="Segoe UI Symbol" w:cs="Segoe UI Symbol" w:eastAsia="Segoe UI Symbol" w:hAnsi="Segoe UI Symbol"/>
+                <w:color w:val="5D534C"/>
+                <w:sz w:val="20"/>
+                <w:szCs w:val="20"/>
+              </w:rPr>
+              <w:t xml:space="preserve">☐ </w:t>
+            </w:r>
+          </w:p>
+        </w:tc>
+      </w:tr>
+      <w:tr>
+        <w:tc>
+          <w:tcPr>
+            <w:tcW w:type="dxa" w:w="8804"/>
+            <w:tcBorders>
+              <w:top w:val="single" w:color="D4D0C5" w:sz="4"/>
+              <w:left w:val="none" w:color="FFFFFF" w:sz="0"/>
+              <w:bottom w:val="none" w:color="FFFFFF" w:sz="0"/>
+              <w:right w:val="none" w:color="FFFFFF" w:sz="0"/>
+            </w:tcBorders>
+            <w:tcMar>
+              <w:top w:type="dxa" w:w="60"/>
+              <w:left w:type="dxa" w:w="0"/>
+              <w:bottom w:type="dxa" w:w="60"/>
+              <w:right w:type="dxa" w:w="100"/>
+            </w:tcMar>
+          </w:tcPr>
+          <w:p>
+            <w:pPr>
+              <w:spacing w:after="0" w:before="0"/>
+            </w:pPr>
+            <w:r>
+              <w:rPr>
+                <w:rFonts w:ascii="Arial" w:cs="Arial" w:eastAsia="Arial" w:hAnsi="Arial"/>
+                <w:color w:val="5D534C"/>
+                <w:sz w:val="18"/>
+                <w:szCs w:val="18"/>
+              </w:rPr>
+              <w:t xml:space="preserve">Haben Sie in den letzten 48 Stunden ein Potenzmittel (z. B. Sildenafil, Tadalafil) eingenommen?</w:t>
+            </w:r>
+          </w:p>
+        </w:tc>
+        <w:tc>
+          <w:tcPr>
+            <w:tcW w:type="dxa" w:w="700"/>
+            <w:tcBorders>
+              <w:top w:val="single" w:color="D4D0C5" w:sz="4"/>
+              <w:left w:val="none" w:color="FFFFFF" w:sz="0"/>
+              <w:bottom w:val="none" w:color="FFFFFF" w:sz="0"/>
+              <w:right w:val="none" w:color="FFFFFF" w:sz="0"/>
+            </w:tcBorders>
+            <w:tcMar>
+              <w:top w:type="dxa" w:w="60"/>
+              <w:left w:type="dxa" w:w="100"/>
+              <w:bottom w:type="dxa" w:w="60"/>
+              <w:right w:type="dxa" w:w="100"/>
+            </w:tcMar>
+          </w:tcPr>
+          <w:p>
+            <w:pPr>
+              <w:spacing w:after="0" w:before="0"/>
+              <w:jc w:val="center"/>
+            </w:pPr>
+            <w:r>
+              <w:rPr>
+                <w:rFonts w:ascii="Segoe UI Symbol" w:cs="Segoe UI Symbol" w:eastAsia="Segoe UI Symbol" w:hAnsi="Segoe UI Symbol"/>
+                <w:color w:val="5D534C"/>
+                <w:sz w:val="20"/>
+                <w:szCs w:val="20"/>
+              </w:rPr>
+              <w:t xml:space="preserve">☐ </w:t>
+            </w:r>
+          </w:p>
+        </w:tc>
+        <w:tc>
+          <w:tcPr>
+            <w:tcW w:type="dxa" w:w="700"/>
+            <w:tcBorders>
+              <w:top w:val="single" w:color="D4D0C5" w:sz="4"/>
+              <w:left w:val="none" w:color="FFFFFF" w:sz="0"/>
+              <w:bottom w:val="none" w:color="FFFFFF" w:sz="0"/>
+              <w:right w:val="none" w:color="FFFFFF" w:sz="0"/>
+            </w:tcBorders>
+            <w:tcMar>
+              <w:top w:type="dxa" w:w="60"/>
+              <w:left w:type="dxa" w:w="100"/>
+              <w:bottom w:type="dxa" w:w="60"/>
+              <w:right w:type="dxa" w:w="100"/>
+            </w:tcMar>
+          </w:tcPr>
+          <w:p>
+            <w:pPr>
+              <w:spacing w:after="0" w:before="0"/>
+              <w:jc w:val="center"/>
+            </w:pPr>
+            <w:r>
+              <w:rPr>
+                <w:rFonts w:ascii="Segoe UI Symbol" w:cs="Segoe UI Symbol" w:eastAsia="Segoe UI Symbol" w:hAnsi="Segoe UI Symbol"/>
+                <w:color w:val="5D534C"/>
+                <w:sz w:val="20"/>
+                <w:szCs w:val="20"/>
+              </w:rPr>
+              <w:t xml:space="preserve">☐ </w:t>
+            </w:r>
+          </w:p>
+        </w:tc>
+      </w:tr>
+      <w:tr>
+        <w:tc>
+          <w:tcPr>
+            <w:tcW w:type="dxa" w:w="8804"/>
+            <w:tcBorders>
+              <w:top w:val="single" w:color="D4D0C5" w:sz="4"/>
+              <w:left w:val="none" w:color="FFFFFF" w:sz="0"/>
+              <w:bottom w:val="none" w:color="FFFFFF" w:sz="0"/>
+              <w:right w:val="none" w:color="FFFFFF" w:sz="0"/>
+            </w:tcBorders>
+            <w:tcMar>
+              <w:top w:type="dxa" w:w="60"/>
+              <w:left w:type="dxa" w:w="0"/>
+              <w:bottom w:type="dxa" w:w="60"/>
+              <w:right w:type="dxa" w:w="100"/>
+            </w:tcMar>
+          </w:tcPr>
+          <w:p>
+            <w:pPr>
+              <w:spacing w:after="0" w:before="0"/>
+            </w:pPr>
+            <w:r>
+              <w:rPr>
+                <w:rFonts w:ascii="Arial" w:cs="Arial" w:eastAsia="Arial" w:hAnsi="Arial"/>
+                <w:color w:val="5D534C"/>
+                <w:sz w:val="18"/>
+                <w:szCs w:val="18"/>
+              </w:rPr>
+              <w:t xml:space="preserve">Haben Sie Asthma?</w:t>
+            </w:r>
+          </w:p>
+        </w:tc>
+        <w:tc>
+          <w:tcPr>
+            <w:tcW w:type="dxa" w:w="700"/>
+            <w:tcBorders>
+              <w:top w:val="single" w:color="D4D0C5" w:sz="4"/>
+              <w:left w:val="none" w:color="FFFFFF" w:sz="0"/>
+              <w:bottom w:val="none" w:color="FFFFFF" w:sz="0"/>
+              <w:right w:val="none" w:color="FFFFFF" w:sz="0"/>
+            </w:tcBorders>
+            <w:tcMar>
+              <w:top w:type="dxa" w:w="60"/>
+              <w:left w:type="dxa" w:w="100"/>
+              <w:bottom w:type="dxa" w:w="60"/>
+              <w:right w:type="dxa" w:w="100"/>
+            </w:tcMar>
+          </w:tcPr>
+          <w:p>
+            <w:pPr>
+              <w:spacing w:after="0" w:before="0"/>
+              <w:jc w:val="center"/>
+            </w:pPr>
+            <w:r>
+              <w:rPr>
+                <w:rFonts w:ascii="Segoe UI Symbol" w:cs="Segoe UI Symbol" w:eastAsia="Segoe UI Symbol" w:hAnsi="Segoe UI Symbol"/>
+                <w:color w:val="5D534C"/>
+                <w:sz w:val="20"/>
+                <w:szCs w:val="20"/>
+              </w:rPr>
+              <w:t xml:space="preserve">☐ </w:t>
+            </w:r>
+          </w:p>
+        </w:tc>
+        <w:tc>
+          <w:tcPr>
+            <w:tcW w:type="dxa" w:w="700"/>
+            <w:tcBorders>
+              <w:top w:val="single" w:color="D4D0C5" w:sz="4"/>
+              <w:left w:val="none" w:color="FFFFFF" w:sz="0"/>
+              <w:bottom w:val="none" w:color="FFFFFF" w:sz="0"/>
+              <w:right w:val="none" w:color="FFFFFF" w:sz="0"/>
+            </w:tcBorders>
+            <w:tcMar>
+              <w:top w:type="dxa" w:w="60"/>
+              <w:left w:type="dxa" w:w="100"/>
+              <w:bottom w:type="dxa" w:w="60"/>
+              <w:right w:type="dxa" w:w="100"/>
+            </w:tcMar>
+          </w:tcPr>
+          <w:p>
+            <w:pPr>
+              <w:spacing w:after="0" w:before="0"/>
+              <w:jc w:val="center"/>
+            </w:pPr>
+            <w:r>
+              <w:rPr>
+                <w:rFonts w:ascii="Segoe UI Symbol" w:cs="Segoe UI Symbol" w:eastAsia="Segoe UI Symbol" w:hAnsi="Segoe UI Symbol"/>
+                <w:color w:val="5D534C"/>
+                <w:sz w:val="20"/>
+                <w:szCs w:val="20"/>
+              </w:rPr>
+              <w:t xml:space="preserve">☐ </w:t>
+            </w:r>
+          </w:p>
+        </w:tc>
+      </w:tr>
+    </w:tbl>
+    <w:p>
+      <w:pPr>
+        <w:keepNext/>
+        <w:tabs>
+          <w:tab w:val="right" w:pos="10204"/>
+        </w:tabs>
+        <w:spacing w:after="100" w:before="200"/>
+      </w:pPr>
+      <w:r>
+        <w:rPr>
+          <w:rFonts w:ascii="Arial" w:cs="Arial" w:eastAsia="Arial" w:hAnsi="Arial"/>
+          <w:b/>
+          <w:bCs/>
+          <w:color w:val="FFFFFF"/>
+          <w:sz w:val="18"/>
+          <w:szCs w:val="18"/>
+          <w:shd w:fill="007AA8" w:color="auto" w:val="clear"/>
+        </w:rPr>
         <w:t xml:space="preserve"> 2 </w:t>
       </w:r>
       <w:r>
@@ -2067,6 +2357,241 @@
       </w:tr>
     </w:tbl>
     <w:p>
+      <w:r>
+        <w:br w:type="page"/>
+      </w:r>
+    </w:p>
+    <w:tbl>
+      <w:tblPr>
+        <w:tblW w:type="dxa" w:w="10204"/>
+        <w:tblBorders>
+          <w:top w:val="none" w:color="FFFFFF" w:sz="0"/>
+          <w:left w:val="none" w:color="FFFFFF" w:sz="0"/>
+          <w:bottom w:val="none" w:color="FFFFFF" w:sz="0"/>
+          <w:right w:val="none" w:color="FFFFFF" w:sz="0"/>
+          <w:insideH w:val="none" w:color="FFFFFF" w:sz="0"/>
+          <w:insideV w:val="none" w:color="FFFFFF" w:sz="0"/>
+        </w:tblBorders>
+        <w:tblLayout w:type="fixed"/>
+      </w:tblPr>
+      <w:tblGrid>
+        <w:gridCol w:w="3000"/>
+        <w:gridCol w:w="6204"/>
+        <w:gridCol w:w="1000"/>
+      </w:tblGrid>
+      <w:tr>
+        <w:tc>
+          <w:tcPr>
+            <w:tcW w:type="dxa" w:w="3000"/>
+            <w:tcBorders>
+              <w:top w:val="none" w:color="FFFFFF" w:sz="0"/>
+              <w:left w:val="none" w:color="FFFFFF" w:sz="0"/>
+              <w:bottom w:val="none" w:color="FFFFFF" w:sz="0"/>
+              <w:right w:val="none" w:color="FFFFFF" w:sz="0"/>
+            </w:tcBorders>
+            <w:tcMar>
+              <w:top w:type="dxa" w:w="60"/>
+              <w:left w:type="dxa" w:w="0"/>
+              <w:bottom w:type="dxa" w:w="60"/>
+              <w:right w:type="dxa" w:w="100"/>
+            </w:tcMar>
+            <w:vAlign w:val="center"/>
+          </w:tcPr>
+          <w:p>
+            <w:pPr>
+              <w:spacing w:after="60" w:before="0"/>
+            </w:pPr>
+            <w:r>
+              <w:drawing>
+                <wp:inline distT="0" distB="0" distL="0" distR="0">
+                  <wp:extent cx="1428750" cy="466725"/>
+                  <wp:effectExtent t="0" r="0" b="0" l="0"/>
+                  <wp:docPr id="1" name="" descr="" title=""/>
+                  <wp:cNvGraphicFramePr>
+                    <a:graphicFrameLocks xmlns:a="http://schemas.openxmlformats.org/drawingml/2006/main" noChangeAspect="1"/>
+                  </wp:cNvGraphicFramePr>
+                  <a:graphic xmlns:a="http://schemas.openxmlformats.org/drawingml/2006/main">
+                    <a:graphicData uri="http://schemas.openxmlformats.org/drawingml/2006/picture">
+                      <pic:pic xmlns:pic="http://schemas.openxmlformats.org/drawingml/2006/picture">
+                        <pic:nvPicPr>
+                          <pic:cNvPr id="0" name="" descr=""/>
+                          <pic:cNvPicPr>
+                            <a:picLocks noChangeAspect="1" noChangeArrowheads="1"/>
+                          </pic:cNvPicPr>
+                        </pic:nvPicPr>
+                        <pic:blipFill>
+                          <a:blip r:embed="rId8" cstate="none"/>
+                          <a:srcRect/>
+                          <a:stretch>
+                            <a:fillRect/>
+                          </a:stretch>
+                        </pic:blipFill>
+                        <pic:spPr bwMode="auto">
+                          <a:xfrm>
+                            <a:off x="0" y="0"/>
+                            <a:ext cx="1428750" cy="466725"/>
+                          </a:xfrm>
+                          <a:prstGeom prst="rect">
+                            <a:avLst/>
+                          </a:prstGeom>
+                        </pic:spPr>
+                      </pic:pic>
+                    </a:graphicData>
+                  </a:graphic>
+                </wp:inline>
+              </w:drawing>
+            </w:r>
+          </w:p>
+        </w:tc>
+        <w:tc>
+          <w:tcPr>
+            <w:tcW w:type="dxa" w:w="6204"/>
+            <w:tcBorders>
+              <w:top w:val="none" w:color="FFFFFF" w:sz="0"/>
+              <w:left w:val="none" w:color="FFFFFF" w:sz="0"/>
+              <w:bottom w:val="none" w:color="FFFFFF" w:sz="0"/>
+              <w:right w:val="none" w:color="FFFFFF" w:sz="0"/>
+            </w:tcBorders>
+            <w:tcMar>
+              <w:top w:type="dxa" w:w="60"/>
+              <w:left w:type="dxa" w:w="100"/>
+              <w:bottom w:type="dxa" w:w="60"/>
+              <w:right w:type="dxa" w:w="100"/>
+            </w:tcMar>
+            <w:vAlign w:val="center"/>
+          </w:tcPr>
+          <w:p>
+            <w:pPr>
+              <w:spacing w:after="0" w:before="0"/>
+              <w:jc w:val="right"/>
+            </w:pPr>
+            <w:r>
+              <w:rPr>
+                <w:rFonts w:ascii="Arial" w:cs="Arial" w:eastAsia="Arial" w:hAnsi="Arial"/>
+                <w:b/>
+                <w:bCs/>
+                <w:caps/>
+                <w:color w:val="007478"/>
+                <w:spacing w:val="14"/>
+                <w:sz w:val="15"/>
+                <w:szCs w:val="15"/>
+              </w:rPr>
+              <w:t xml:space="preserve">CT-Diagnostik · Patienteninformation</w:t>
+            </w:r>
+          </w:p>
+          <w:p>
+            <w:pPr>
+              <w:spacing w:after="0" w:before="0"/>
+              <w:jc w:val="right"/>
+            </w:pPr>
+            <w:r>
+              <w:rPr>
+                <w:rFonts w:ascii="Arial" w:cs="Arial" w:eastAsia="Arial" w:hAnsi="Arial"/>
+                <w:caps/>
+                <w:color w:val="5D534C"/>
+                <w:sz w:val="34"/>
+                <w:szCs w:val="34"/>
+              </w:rPr>
+              <w:t xml:space="preserve">Aufklärung </w:t>
+            </w:r>
+            <w:r>
+              <w:rPr>
+                <w:rFonts w:ascii="Arial" w:cs="Arial" w:eastAsia="Arial" w:hAnsi="Arial"/>
+                <w:b/>
+                <w:bCs/>
+                <w:caps/>
+                <w:color w:val="08658E"/>
+                <w:sz w:val="34"/>
+                <w:szCs w:val="34"/>
+              </w:rPr>
+              <w:t xml:space="preserve">Herz-CT</w:t>
+            </w:r>
+          </w:p>
+        </w:tc>
+        <w:tc>
+          <w:tcPr>
+            <w:tcW w:type="dxa" w:w="1000"/>
+            <w:tcBorders>
+              <w:top w:val="none" w:color="FFFFFF" w:sz="0"/>
+              <w:left w:val="none" w:color="FFFFFF" w:sz="0"/>
+              <w:bottom w:val="none" w:color="FFFFFF" w:sz="0"/>
+              <w:right w:val="none" w:color="FFFFFF" w:sz="0"/>
+            </w:tcBorders>
+            <w:tcMar>
+              <w:top w:type="dxa" w:w="60"/>
+              <w:left w:type="dxa" w:w="100"/>
+              <w:bottom w:type="dxa" w:w="60"/>
+              <w:right w:type="dxa" w:w="0"/>
+            </w:tcMar>
+            <w:vAlign w:val="center"/>
+          </w:tcPr>
+          <w:p>
+            <w:pPr>
+              <w:spacing w:after="60" w:before="0"/>
+              <w:jc w:val="right"/>
+            </w:pPr>
+            <w:r>
+              <w:drawing>
+                <wp:inline distT="0" distB="0" distL="0" distR="0">
+                  <wp:extent cx="438150" cy="514350"/>
+                  <wp:effectExtent t="0" r="0" b="0" l="0"/>
+                  <wp:docPr id="1" name="" descr="" title=""/>
+                  <wp:cNvGraphicFramePr>
+                    <a:graphicFrameLocks xmlns:a="http://schemas.openxmlformats.org/drawingml/2006/main" noChangeAspect="1"/>
+                  </wp:cNvGraphicFramePr>
+                  <a:graphic xmlns:a="http://schemas.openxmlformats.org/drawingml/2006/main">
+                    <a:graphicData uri="http://schemas.openxmlformats.org/drawingml/2006/picture">
+                      <pic:pic xmlns:pic="http://schemas.openxmlformats.org/drawingml/2006/picture">
+                        <pic:nvPicPr>
+                          <pic:cNvPr id="0" name="" descr=""/>
+                          <pic:cNvPicPr>
+                            <a:picLocks noChangeAspect="1" noChangeArrowheads="1"/>
+                          </pic:cNvPicPr>
+                        </pic:nvPicPr>
+                        <pic:blipFill>
+                          <a:blip r:embed="rId9" cstate="none"/>
+                          <a:srcRect/>
+                          <a:stretch>
+                            <a:fillRect/>
+                          </a:stretch>
+                        </pic:blipFill>
+                        <pic:spPr bwMode="auto">
+                          <a:xfrm>
+                            <a:off x="0" y="0"/>
+                            <a:ext cx="438150" cy="514350"/>
+                          </a:xfrm>
+                          <a:prstGeom prst="rect">
+                            <a:avLst/>
+                          </a:prstGeom>
+                        </pic:spPr>
+                      </pic:pic>
+                    </a:graphicData>
+                  </a:graphic>
+                </wp:inline>
+              </w:drawing>
+            </w:r>
+          </w:p>
+        </w:tc>
+      </w:tr>
+    </w:tbl>
+    <w:p>
+      <w:pPr>
+        <w:pBdr>
+          <w:bottom w:val="single" w:color="007AA8" w:sz="12" w:space="1"/>
+        </w:pBdr>
+        <w:spacing w:after="60" w:before="0"/>
+      </w:pPr>
+      <w:r>
+        <w:rPr>
+          <w:rFonts w:ascii="Arial" w:cs="Arial" w:eastAsia="Arial" w:hAnsi="Arial"/>
+          <w:color w:val="5D534C"/>
+          <w:sz w:val="18"/>
+          <w:szCs w:val="18"/>
+        </w:rPr>
+        <w:t xml:space="preserve"/>
+      </w:r>
+    </w:p>
+    <w:p>
       <w:pPr>
         <w:keepNext/>
         <w:tabs>
@@ -2163,7 +2688,7 @@
                 <w:sz w:val="18"/>
                 <w:szCs w:val="18"/>
               </w:rPr>
-              <w:t xml:space="preserve">Mit der unten gegebenen Unterschrift bestätige ich, dass ich die Informationen gelesen und verstanden habe. Ich bin mit einer Kontrastmittelinjektion einverstanden.</w:t>
+              <w:t xml:space="preserve">Mit der unten gegebenen Unterschrift bestätige ich, dass ich die Informationen gelesen und verstanden habe. Ich hatte Gelegenheit, im ärztlichen Aufklärungsgespräch Fragen zu stellen. Ich bin mit der Untersuchung, der Kontrastmittelinjektion sowie der Gabe eines Betablockers und von Nitrospray einverstanden.</w:t>
             </w:r>
           </w:p>
           <w:p>
@@ -2340,6 +2865,136 @@
         </w:tc>
       </w:tr>
     </w:tbl>
+    <w:tbl>
+      <w:tblPr>
+        <w:tblW w:type="dxa" w:w="10204"/>
+        <w:tblBorders>
+          <w:top w:val="none" w:color="FFFFFF" w:sz="0"/>
+          <w:left w:val="none" w:color="FFFFFF" w:sz="0"/>
+          <w:bottom w:val="none" w:color="FFFFFF" w:sz="0"/>
+          <w:right w:val="none" w:color="FFFFFF" w:sz="0"/>
+          <w:insideH w:val="none" w:color="FFFFFF" w:sz="0"/>
+          <w:insideV w:val="none" w:color="FFFFFF" w:sz="0"/>
+        </w:tblBorders>
+        <w:tblLayout w:type="fixed"/>
+      </w:tblPr>
+      <w:tblGrid>
+        <w:gridCol w:w="3877"/>
+        <w:gridCol w:w="6327"/>
+      </w:tblGrid>
+      <w:tr>
+        <w:tc>
+          <w:tcPr>
+            <w:tcW w:type="dxa" w:w="3877"/>
+            <w:tcBorders>
+              <w:top w:val="none" w:color="FFFFFF" w:sz="0"/>
+              <w:left w:val="none" w:color="FFFFFF" w:sz="0"/>
+              <w:bottom w:val="none" w:color="FFFFFF" w:sz="0"/>
+              <w:right w:val="none" w:color="FFFFFF" w:sz="0"/>
+            </w:tcBorders>
+            <w:tcMar>
+              <w:top w:type="dxa" w:w="80"/>
+              <w:left w:type="dxa" w:w="100"/>
+              <w:bottom w:type="dxa" w:w="80"/>
+              <w:right w:type="dxa" w:w="100"/>
+            </w:tcMar>
+          </w:tcPr>
+          <w:p>
+            <w:pPr>
+              <w:spacing w:after="20" w:before="0"/>
+            </w:pPr>
+            <w:r>
+              <w:rPr>
+                <w:rFonts w:ascii="Arial" w:cs="Arial" w:eastAsia="Arial" w:hAnsi="Arial"/>
+                <w:b/>
+                <w:bCs/>
+                <w:caps/>
+                <w:color w:val="7C6E65"/>
+                <w:spacing w:val="10"/>
+                <w:sz w:val="14"/>
+                <w:szCs w:val="14"/>
+              </w:rPr>
+              <w:t xml:space="preserve">Aufklärende Ärztin / Arzt (Name)</w:t>
+            </w:r>
+          </w:p>
+          <w:p>
+            <w:pPr>
+              <w:pBdr>
+                <w:bottom w:val="single" w:color="7C6E65" w:sz="6" w:space="1"/>
+              </w:pBdr>
+              <w:tabs>
+                <w:tab w:val="right" w:pos="3657"/>
+              </w:tabs>
+              <w:spacing w:after="0" w:before="480"/>
+            </w:pPr>
+            <w:r>
+              <w:rPr>
+                <w:rFonts w:ascii="Arial" w:cs="Arial" w:eastAsia="Arial" w:hAnsi="Arial"/>
+                <w:color w:val="7C6E65"/>
+                <w:sz w:val="16"/>
+                <w:szCs w:val="16"/>
+              </w:rPr>
+              <w:t xml:space="preserve"/>
+            </w:r>
+          </w:p>
+        </w:tc>
+        <w:tc>
+          <w:tcPr>
+            <w:tcW w:type="dxa" w:w="6327"/>
+            <w:tcBorders>
+              <w:top w:val="none" w:color="FFFFFF" w:sz="0"/>
+              <w:left w:val="none" w:color="FFFFFF" w:sz="0"/>
+              <w:bottom w:val="none" w:color="FFFFFF" w:sz="0"/>
+              <w:right w:val="none" w:color="FFFFFF" w:sz="0"/>
+            </w:tcBorders>
+            <w:tcMar>
+              <w:top w:type="dxa" w:w="80"/>
+              <w:left w:type="dxa" w:w="100"/>
+              <w:bottom w:type="dxa" w:w="80"/>
+              <w:right w:type="dxa" w:w="100"/>
+            </w:tcMar>
+          </w:tcPr>
+          <w:p>
+            <w:pPr>
+              <w:spacing w:after="20" w:before="0"/>
+            </w:pPr>
+            <w:r>
+              <w:rPr>
+                <w:rFonts w:ascii="Arial" w:cs="Arial" w:eastAsia="Arial" w:hAnsi="Arial"/>
+                <w:b/>
+                <w:bCs/>
+                <w:caps/>
+                <w:color w:val="7C6E65"/>
+                <w:spacing w:val="10"/>
+                <w:sz w:val="14"/>
+                <w:szCs w:val="14"/>
+              </w:rPr>
+              <w:t xml:space="preserve">Datum, Unterschrift Ärztin / Arzt</w:t>
+            </w:r>
+          </w:p>
+          <w:p>
+            <w:pPr>
+              <w:pBdr>
+                <w:bottom w:val="single" w:color="7C6E65" w:sz="6" w:space="1"/>
+              </w:pBdr>
+              <w:tabs>
+                <w:tab w:val="right" w:pos="6107"/>
+              </w:tabs>
+              <w:spacing w:after="0" w:before="480"/>
+            </w:pPr>
+            <w:r>
+              <w:rPr>
+                <w:rFonts w:ascii="Arial" w:cs="Arial" w:eastAsia="Arial" w:hAnsi="Arial"/>
+                <w:color w:val="7C6E65"/>
+                <w:sz w:val="16"/>
+                <w:szCs w:val="16"/>
+              </w:rPr>
+              <w:t xml:space="preserve"/>
+            </w:r>
+          </w:p>
+        </w:tc>
+      </w:tr>
+    </w:tbl>
     <w:p>
       <w:pPr>
         <w:spacing w:after="160" w:before="0"/>
@@ -3070,6 +3725,53 @@
           <w:szCs w:val="18"/>
         </w:rPr>
         <w:t xml:space="preserve">Metohexal:   </w:t>
+      </w:r>
+      <w:r>
+        <w:rPr>
+          <w:rFonts w:ascii="Segoe UI Symbol" w:cs="Segoe UI Symbol" w:eastAsia="Segoe UI Symbol" w:hAnsi="Segoe UI Symbol"/>
+          <w:color w:val="5D534C"/>
+          <w:sz w:val="20"/>
+          <w:szCs w:val="20"/>
+        </w:rPr>
+        <w:t xml:space="preserve">☐ </w:t>
+      </w:r>
+      <w:r>
+        <w:rPr>
+          <w:rFonts w:ascii="Arial" w:cs="Arial" w:eastAsia="Arial" w:hAnsi="Arial"/>
+          <w:color w:val="5D534C"/>
+          <w:sz w:val="18"/>
+          <w:szCs w:val="18"/>
+        </w:rPr>
+        <w:t xml:space="preserve">nein     </w:t>
+      </w:r>
+      <w:r>
+        <w:rPr>
+          <w:rFonts w:ascii="Segoe UI Symbol" w:cs="Segoe UI Symbol" w:eastAsia="Segoe UI Symbol" w:hAnsi="Segoe UI Symbol"/>
+          <w:color w:val="5D534C"/>
+          <w:sz w:val="20"/>
+          <w:szCs w:val="20"/>
+        </w:rPr>
+        <w:t xml:space="preserve">☐ </w:t>
+      </w:r>
+      <w:r>
+        <w:rPr>
+          <w:rFonts w:ascii="Arial" w:cs="Arial" w:eastAsia="Arial" w:hAnsi="Arial"/>
+          <w:color w:val="5D534C"/>
+          <w:sz w:val="18"/>
+          <w:szCs w:val="18"/>
+        </w:rPr>
+        <w:t xml:space="preserve">ja, Dosis / Uhrzeit: ______________        </w:t>
+      </w:r>
+      <w:r>
+        <w:rPr>
+          <w:rFonts w:ascii="Arial" w:cs="Arial" w:eastAsia="Arial" w:hAnsi="Arial"/>
+          <w:b/>
+          <w:bCs/>
+          <w:color w:val="5D534C"/>
+          <w:sz w:val="18"/>
+          <w:szCs w:val="18"/>
+        </w:rPr>
+        <w:t xml:space="preserve">Nitrospray:   </w:t>
       </w:r>
       <w:r>
         <w:rPr>

</xml_diff>

<commit_message>
Aufklärung Herz-CT auf zwei Seiten gekürzt
Personenangaben auf Seite 1, Fragebogen, Einverständnis und Personalteil
auf Seite 2; Inhalt unverändert.

Co-Authored-By: Claude Opus 5.5 <noreply@anthropic.com>
Claude-Session: https://claude.ai/code/session_01VnQ85SLBBZDMd7wK23yYnL
</commit_message>
<xml_diff>
--- a/docs/vorlagen/aufklaerung-herz-ct-radiologie-dammtor.docx
+++ b/docs/vorlagen/aufklaerung-herz-ct-radiologie-dammtor.docx
@@ -247,9 +247,307 @@
         <w:t xml:space="preserve">Radiologie Dammtor · Dammtorwall 7a · 20354 Hamburg   ·   Telefon 040 3500484-0   ·   info@radiologie-dammtor.de</w:t>
       </w:r>
     </w:p>
+    <w:tbl>
+      <w:tblPr>
+        <w:tblW w:type="dxa" w:w="10204"/>
+        <w:tblBorders>
+          <w:top w:val="none" w:color="FFFFFF" w:sz="0"/>
+          <w:left w:val="none" w:color="FFFFFF" w:sz="0"/>
+          <w:bottom w:val="none" w:color="FFFFFF" w:sz="0"/>
+          <w:right w:val="none" w:color="FFFFFF" w:sz="0"/>
+          <w:insideH w:val="none" w:color="FFFFFF" w:sz="0"/>
+          <w:insideV w:val="none" w:color="FFFFFF" w:sz="0"/>
+        </w:tblBorders>
+        <w:tblLayout w:type="fixed"/>
+      </w:tblPr>
+      <w:tblGrid>
+        <w:gridCol w:w="3061"/>
+        <w:gridCol w:w="1122"/>
+        <w:gridCol w:w="1122"/>
+        <w:gridCol w:w="2040"/>
+        <w:gridCol w:w="2859"/>
+      </w:tblGrid>
+      <w:tr>
+        <w:tc>
+          <w:tcPr>
+            <w:tcW w:type="dxa" w:w="3061"/>
+            <w:tcBorders>
+              <w:top w:val="none" w:color="FFFFFF" w:sz="0"/>
+              <w:left w:val="none" w:color="FFFFFF" w:sz="0"/>
+              <w:bottom w:val="none" w:color="FFFFFF" w:sz="0"/>
+              <w:right w:val="none" w:color="FFFFFF" w:sz="0"/>
+            </w:tcBorders>
+            <w:tcMar>
+              <w:top w:type="dxa" w:w="80"/>
+              <w:left w:type="dxa" w:w="100"/>
+              <w:bottom w:type="dxa" w:w="80"/>
+              <w:right w:type="dxa" w:w="100"/>
+            </w:tcMar>
+          </w:tcPr>
+          <w:p>
+            <w:pPr>
+              <w:spacing w:after="20" w:before="0"/>
+            </w:pPr>
+            <w:r>
+              <w:rPr>
+                <w:rFonts w:ascii="Arial" w:cs="Arial" w:eastAsia="Arial" w:hAnsi="Arial"/>
+                <w:b/>
+                <w:bCs/>
+                <w:caps/>
+                <w:color w:val="7C6E65"/>
+                <w:spacing w:val="10"/>
+                <w:sz w:val="14"/>
+                <w:szCs w:val="14"/>
+              </w:rPr>
+              <w:t xml:space="preserve">Name Patientin / Patient</w:t>
+            </w:r>
+          </w:p>
+          <w:p>
+            <w:pPr>
+              <w:pBdr>
+                <w:bottom w:val="single" w:color="7C6E65" w:sz="6" w:space="1"/>
+              </w:pBdr>
+              <w:tabs>
+                <w:tab w:val="right" w:pos="2841"/>
+              </w:tabs>
+              <w:spacing w:after="0" w:before="340"/>
+            </w:pPr>
+            <w:r>
+              <w:rPr>
+                <w:rFonts w:ascii="Arial" w:cs="Arial" w:eastAsia="Arial" w:hAnsi="Arial"/>
+                <w:color w:val="7C6E65"/>
+                <w:sz w:val="16"/>
+                <w:szCs w:val="16"/>
+              </w:rPr>
+              <w:t xml:space="preserve"/>
+            </w:r>
+          </w:p>
+        </w:tc>
+        <w:tc>
+          <w:tcPr>
+            <w:tcW w:type="dxa" w:w="1122"/>
+            <w:tcBorders>
+              <w:top w:val="none" w:color="FFFFFF" w:sz="0"/>
+              <w:left w:val="none" w:color="FFFFFF" w:sz="0"/>
+              <w:bottom w:val="none" w:color="FFFFFF" w:sz="0"/>
+              <w:right w:val="none" w:color="FFFFFF" w:sz="0"/>
+            </w:tcBorders>
+            <w:tcMar>
+              <w:top w:type="dxa" w:w="80"/>
+              <w:left w:type="dxa" w:w="100"/>
+              <w:bottom w:type="dxa" w:w="80"/>
+              <w:right w:type="dxa" w:w="100"/>
+            </w:tcMar>
+          </w:tcPr>
+          <w:p>
+            <w:pPr>
+              <w:spacing w:after="20" w:before="0"/>
+            </w:pPr>
+            <w:r>
+              <w:rPr>
+                <w:rFonts w:ascii="Arial" w:cs="Arial" w:eastAsia="Arial" w:hAnsi="Arial"/>
+                <w:b/>
+                <w:bCs/>
+                <w:caps/>
+                <w:color w:val="7C6E65"/>
+                <w:spacing w:val="10"/>
+                <w:sz w:val="14"/>
+                <w:szCs w:val="14"/>
+              </w:rPr>
+              <w:t xml:space="preserve">Größe</w:t>
+            </w:r>
+          </w:p>
+          <w:p>
+            <w:pPr>
+              <w:pBdr>
+                <w:bottom w:val="single" w:color="7C6E65" w:sz="6" w:space="1"/>
+              </w:pBdr>
+              <w:tabs>
+                <w:tab w:val="right" w:pos="902"/>
+              </w:tabs>
+              <w:spacing w:after="0" w:before="340"/>
+            </w:pPr>
+            <w:r>
+              <w:rPr>
+                <w:rFonts w:ascii="Arial" w:cs="Arial" w:eastAsia="Arial" w:hAnsi="Arial"/>
+                <w:color w:val="7C6E65"/>
+                <w:sz w:val="16"/>
+                <w:szCs w:val="16"/>
+              </w:rPr>
+              <w:t xml:space="preserve">	cm</w:t>
+            </w:r>
+          </w:p>
+        </w:tc>
+        <w:tc>
+          <w:tcPr>
+            <w:tcW w:type="dxa" w:w="1122"/>
+            <w:tcBorders>
+              <w:top w:val="none" w:color="FFFFFF" w:sz="0"/>
+              <w:left w:val="none" w:color="FFFFFF" w:sz="0"/>
+              <w:bottom w:val="none" w:color="FFFFFF" w:sz="0"/>
+              <w:right w:val="none" w:color="FFFFFF" w:sz="0"/>
+            </w:tcBorders>
+            <w:tcMar>
+              <w:top w:type="dxa" w:w="80"/>
+              <w:left w:type="dxa" w:w="100"/>
+              <w:bottom w:type="dxa" w:w="80"/>
+              <w:right w:type="dxa" w:w="100"/>
+            </w:tcMar>
+          </w:tcPr>
+          <w:p>
+            <w:pPr>
+              <w:spacing w:after="20" w:before="0"/>
+            </w:pPr>
+            <w:r>
+              <w:rPr>
+                <w:rFonts w:ascii="Arial" w:cs="Arial" w:eastAsia="Arial" w:hAnsi="Arial"/>
+                <w:b/>
+                <w:bCs/>
+                <w:caps/>
+                <w:color w:val="7C6E65"/>
+                <w:spacing w:val="10"/>
+                <w:sz w:val="14"/>
+                <w:szCs w:val="14"/>
+              </w:rPr>
+              <w:t xml:space="preserve">Gewicht</w:t>
+            </w:r>
+          </w:p>
+          <w:p>
+            <w:pPr>
+              <w:pBdr>
+                <w:bottom w:val="single" w:color="7C6E65" w:sz="6" w:space="1"/>
+              </w:pBdr>
+              <w:tabs>
+                <w:tab w:val="right" w:pos="902"/>
+              </w:tabs>
+              <w:spacing w:after="0" w:before="340"/>
+            </w:pPr>
+            <w:r>
+              <w:rPr>
+                <w:rFonts w:ascii="Arial" w:cs="Arial" w:eastAsia="Arial" w:hAnsi="Arial"/>
+                <w:color w:val="7C6E65"/>
+                <w:sz w:val="16"/>
+                <w:szCs w:val="16"/>
+              </w:rPr>
+              <w:t xml:space="preserve">	kg</w:t>
+            </w:r>
+          </w:p>
+        </w:tc>
+        <w:tc>
+          <w:tcPr>
+            <w:tcW w:type="dxa" w:w="2040"/>
+            <w:tcBorders>
+              <w:top w:val="none" w:color="FFFFFF" w:sz="0"/>
+              <w:left w:val="none" w:color="FFFFFF" w:sz="0"/>
+              <w:bottom w:val="none" w:color="FFFFFF" w:sz="0"/>
+              <w:right w:val="none" w:color="FFFFFF" w:sz="0"/>
+            </w:tcBorders>
+            <w:tcMar>
+              <w:top w:type="dxa" w:w="80"/>
+              <w:left w:type="dxa" w:w="100"/>
+              <w:bottom w:type="dxa" w:w="80"/>
+              <w:right w:type="dxa" w:w="100"/>
+            </w:tcMar>
+          </w:tcPr>
+          <w:p>
+            <w:pPr>
+              <w:spacing w:after="20" w:before="0"/>
+            </w:pPr>
+            <w:r>
+              <w:rPr>
+                <w:rFonts w:ascii="Arial" w:cs="Arial" w:eastAsia="Arial" w:hAnsi="Arial"/>
+                <w:b/>
+                <w:bCs/>
+                <w:caps/>
+                <w:color w:val="7C6E65"/>
+                <w:spacing w:val="10"/>
+                <w:sz w:val="14"/>
+                <w:szCs w:val="14"/>
+              </w:rPr>
+              <w:t xml:space="preserve">Handynummer</w:t>
+            </w:r>
+          </w:p>
+          <w:p>
+            <w:pPr>
+              <w:pBdr>
+                <w:bottom w:val="single" w:color="7C6E65" w:sz="6" w:space="1"/>
+              </w:pBdr>
+              <w:tabs>
+                <w:tab w:val="right" w:pos="1820"/>
+              </w:tabs>
+              <w:spacing w:after="0" w:before="340"/>
+            </w:pPr>
+            <w:r>
+              <w:rPr>
+                <w:rFonts w:ascii="Arial" w:cs="Arial" w:eastAsia="Arial" w:hAnsi="Arial"/>
+                <w:color w:val="7C6E65"/>
+                <w:sz w:val="16"/>
+                <w:szCs w:val="16"/>
+              </w:rPr>
+              <w:t xml:space="preserve"/>
+            </w:r>
+          </w:p>
+        </w:tc>
+        <w:tc>
+          <w:tcPr>
+            <w:tcW w:type="dxa" w:w="2859"/>
+            <w:tcBorders>
+              <w:top w:val="none" w:color="FFFFFF" w:sz="0"/>
+              <w:left w:val="none" w:color="FFFFFF" w:sz="0"/>
+              <w:bottom w:val="none" w:color="FFFFFF" w:sz="0"/>
+              <w:right w:val="none" w:color="FFFFFF" w:sz="0"/>
+            </w:tcBorders>
+            <w:tcMar>
+              <w:top w:type="dxa" w:w="80"/>
+              <w:left w:type="dxa" w:w="100"/>
+              <w:bottom w:type="dxa" w:w="80"/>
+              <w:right w:type="dxa" w:w="100"/>
+            </w:tcMar>
+          </w:tcPr>
+          <w:p>
+            <w:pPr>
+              <w:spacing w:after="20" w:before="0"/>
+            </w:pPr>
+            <w:r>
+              <w:rPr>
+                <w:rFonts w:ascii="Arial" w:cs="Arial" w:eastAsia="Arial" w:hAnsi="Arial"/>
+                <w:b/>
+                <w:bCs/>
+                <w:caps/>
+                <w:color w:val="7C6E65"/>
+                <w:spacing w:val="10"/>
+                <w:sz w:val="14"/>
+                <w:szCs w:val="14"/>
+              </w:rPr>
+              <w:t xml:space="preserve">E-Mail-Adresse</w:t>
+            </w:r>
+          </w:p>
+          <w:p>
+            <w:pPr>
+              <w:pBdr>
+                <w:bottom w:val="single" w:color="7C6E65" w:sz="6" w:space="1"/>
+              </w:pBdr>
+              <w:tabs>
+                <w:tab w:val="right" w:pos="2639"/>
+              </w:tabs>
+              <w:spacing w:after="0" w:before="340"/>
+            </w:pPr>
+            <w:r>
+              <w:rPr>
+                <w:rFonts w:ascii="Arial" w:cs="Arial" w:eastAsia="Arial" w:hAnsi="Arial"/>
+                <w:color w:val="7C6E65"/>
+                <w:sz w:val="16"/>
+                <w:szCs w:val="16"/>
+              </w:rPr>
+              <w:t xml:space="preserve"/>
+            </w:r>
+          </w:p>
+        </w:tc>
+      </w:tr>
+    </w:tbl>
     <w:p>
       <w:pPr>
-        <w:spacing w:after="100" w:before="0"/>
+        <w:spacing w:after="100" w:before="160"/>
       </w:pPr>
       <w:r>
         <w:rPr>
@@ -1225,7 +1523,7 @@
           </w:tcPr>
           <w:p>
             <w:pPr>
-              <w:spacing w:after="20" w:before="0"/>
+              <w:spacing w:after="0" w:before="0"/>
             </w:pPr>
             <w:r>
               <w:rPr>
@@ -1236,11 +1534,6 @@
               </w:rPr>
               <w:t xml:space="preserve">Sind Sie zuckerkrank, nehmen Sie dafür Medikamente ein?</w:t>
             </w:r>
-          </w:p>
-          <w:p>
-            <w:pPr>
-              <w:spacing w:after="0" w:before="0"/>
-            </w:pPr>
             <w:r>
               <w:rPr>
                 <w:rFonts w:ascii="Arial" w:cs="Arial" w:eastAsia="Arial" w:hAnsi="Arial"/>
@@ -1248,7 +1541,7 @@
                 <w:sz w:val="16"/>
                 <w:szCs w:val="16"/>
               </w:rPr>
-              <w:t xml:space="preserve">Wenn ja, welche?</w:t>
+              <w:t xml:space="preserve">   Wenn ja, welche?</w:t>
             </w:r>
           </w:p>
           <w:p>
@@ -1256,7 +1549,7 @@
               <w:pBdr>
                 <w:bottom w:val="single" w:color="7C6E65" w:sz="6" w:space="1"/>
               </w:pBdr>
-              <w:spacing w:after="40" w:before="260"/>
+              <w:spacing w:after="30" w:before="200"/>
             </w:pPr>
             <w:r>
               <w:rPr>
@@ -1450,7 +1743,7 @@
           </w:tcPr>
           <w:p>
             <w:pPr>
-              <w:spacing w:after="20" w:before="0"/>
+              <w:spacing w:after="0" w:before="0"/>
             </w:pPr>
             <w:r>
               <w:rPr>
@@ -1461,11 +1754,6 @@
               </w:rPr>
               <w:t xml:space="preserve">Besteht eine Herz-/Kreislauferkrankung (z. B. koronare Herzkrankheit, Bluthochdruck)?</w:t>
             </w:r>
-          </w:p>
-          <w:p>
-            <w:pPr>
-              <w:spacing w:after="0" w:before="0"/>
-            </w:pPr>
             <w:r>
               <w:rPr>
                 <w:rFonts w:ascii="Arial" w:cs="Arial" w:eastAsia="Arial" w:hAnsi="Arial"/>
@@ -1473,7 +1761,7 @@
                 <w:sz w:val="16"/>
                 <w:szCs w:val="16"/>
               </w:rPr>
-              <w:t xml:space="preserve">Wenn ja, bitte angeben:</w:t>
+              <w:t xml:space="preserve">   Wenn ja, bitte angeben:</w:t>
             </w:r>
           </w:p>
           <w:p>
@@ -1481,7 +1769,7 @@
               <w:pBdr>
                 <w:bottom w:val="single" w:color="7C6E65" w:sz="6" w:space="1"/>
               </w:pBdr>
-              <w:spacing w:after="40" w:before="260"/>
+              <w:spacing w:after="30" w:before="200"/>
             </w:pPr>
             <w:r>
               <w:rPr>
@@ -1578,7 +1866,7 @@
           </w:tcPr>
           <w:p>
             <w:pPr>
-              <w:spacing w:after="20" w:before="0"/>
+              <w:spacing w:after="0" w:before="0"/>
             </w:pPr>
             <w:r>
               <w:rPr>
@@ -1589,11 +1877,6 @@
               </w:rPr>
               <w:t xml:space="preserve">Nehmen Sie Medikamente gegen eine bestehende Herz-/Kreislauferkrankung?</w:t>
             </w:r>
-          </w:p>
-          <w:p>
-            <w:pPr>
-              <w:spacing w:after="0" w:before="0"/>
-            </w:pPr>
             <w:r>
               <w:rPr>
                 <w:rFonts w:ascii="Arial" w:cs="Arial" w:eastAsia="Arial" w:hAnsi="Arial"/>
@@ -1601,7 +1884,7 @@
                 <w:sz w:val="16"/>
                 <w:szCs w:val="16"/>
               </w:rPr>
-              <w:t xml:space="preserve">Wenn ja, welche?</w:t>
+              <w:t xml:space="preserve">   Wenn ja, welche?</w:t>
             </w:r>
           </w:p>
           <w:p>
@@ -1609,7 +1892,7 @@
               <w:pBdr>
                 <w:bottom w:val="single" w:color="7C6E65" w:sz="6" w:space="1"/>
               </w:pBdr>
-              <w:spacing w:after="40" w:before="260"/>
+              <w:spacing w:after="30" w:before="200"/>
             </w:pPr>
             <w:r>
               <w:rPr>
@@ -1998,618 +2281,6 @@
           <w:shd w:fill="007AA8" w:color="auto" w:val="clear"/>
         </w:rPr>
         <w:t xml:space="preserve"> 2 </w:t>
-      </w:r>
-      <w:r>
-        <w:rPr>
-          <w:rFonts w:ascii="Arial" w:cs="Arial" w:eastAsia="Arial" w:hAnsi="Arial"/>
-          <w:color w:val="5D534C"/>
-          <w:sz w:val="18"/>
-          <w:szCs w:val="18"/>
-        </w:rPr>
-        <w:t xml:space="preserve">  </w:t>
-      </w:r>
-      <w:r>
-        <w:rPr>
-          <w:rFonts w:ascii="Arial" w:cs="Arial" w:eastAsia="Arial" w:hAnsi="Arial"/>
-          <w:b/>
-          <w:bCs/>
-          <w:caps/>
-          <w:color w:val="5D534C"/>
-          <w:spacing w:val="10"/>
-          <w:sz w:val="20"/>
-          <w:szCs w:val="20"/>
-        </w:rPr>
-        <w:t xml:space="preserve">Angaben zur Person</w:t>
-      </w:r>
-    </w:p>
-    <w:tbl>
-      <w:tblPr>
-        <w:tblW w:type="dxa" w:w="10204"/>
-        <w:tblBorders>
-          <w:top w:val="none" w:color="FFFFFF" w:sz="0"/>
-          <w:left w:val="none" w:color="FFFFFF" w:sz="0"/>
-          <w:bottom w:val="none" w:color="FFFFFF" w:sz="0"/>
-          <w:right w:val="none" w:color="FFFFFF" w:sz="0"/>
-          <w:insideH w:val="none" w:color="FFFFFF" w:sz="0"/>
-          <w:insideV w:val="none" w:color="FFFFFF" w:sz="0"/>
-        </w:tblBorders>
-        <w:tblLayout w:type="fixed"/>
-      </w:tblPr>
-      <w:tblGrid>
-        <w:gridCol w:w="10204"/>
-      </w:tblGrid>
-      <w:tr>
-        <w:tc>
-          <w:tcPr>
-            <w:tcW w:type="dxa" w:w="10204"/>
-            <w:tcBorders>
-              <w:top w:val="none" w:color="FFFFFF" w:sz="0"/>
-              <w:left w:val="none" w:color="FFFFFF" w:sz="0"/>
-              <w:bottom w:val="none" w:color="FFFFFF" w:sz="0"/>
-              <w:right w:val="none" w:color="FFFFFF" w:sz="0"/>
-            </w:tcBorders>
-            <w:tcMar>
-              <w:top w:type="dxa" w:w="80"/>
-              <w:left w:type="dxa" w:w="100"/>
-              <w:bottom w:type="dxa" w:w="80"/>
-              <w:right w:type="dxa" w:w="100"/>
-            </w:tcMar>
-          </w:tcPr>
-          <w:p>
-            <w:pPr>
-              <w:spacing w:after="20" w:before="0"/>
-            </w:pPr>
-            <w:r>
-              <w:rPr>
-                <w:rFonts w:ascii="Arial" w:cs="Arial" w:eastAsia="Arial" w:hAnsi="Arial"/>
-                <w:b/>
-                <w:bCs/>
-                <w:caps/>
-                <w:color w:val="7C6E65"/>
-                <w:spacing w:val="10"/>
-                <w:sz w:val="14"/>
-                <w:szCs w:val="14"/>
-              </w:rPr>
-              <w:t xml:space="preserve">Name Patientin / Patient</w:t>
-            </w:r>
-          </w:p>
-          <w:p>
-            <w:pPr>
-              <w:pBdr>
-                <w:bottom w:val="single" w:color="7C6E65" w:sz="6" w:space="1"/>
-              </w:pBdr>
-              <w:tabs>
-                <w:tab w:val="right" w:pos="9984"/>
-              </w:tabs>
-              <w:spacing w:after="0" w:before="340"/>
-            </w:pPr>
-            <w:r>
-              <w:rPr>
-                <w:rFonts w:ascii="Arial" w:cs="Arial" w:eastAsia="Arial" w:hAnsi="Arial"/>
-                <w:color w:val="7C6E65"/>
-                <w:sz w:val="16"/>
-                <w:szCs w:val="16"/>
-              </w:rPr>
-              <w:t xml:space="preserve"/>
-            </w:r>
-          </w:p>
-        </w:tc>
-      </w:tr>
-    </w:tbl>
-    <w:tbl>
-      <w:tblPr>
-        <w:tblW w:type="dxa" w:w="10204"/>
-        <w:tblBorders>
-          <w:top w:val="none" w:color="FFFFFF" w:sz="0"/>
-          <w:left w:val="none" w:color="FFFFFF" w:sz="0"/>
-          <w:bottom w:val="none" w:color="FFFFFF" w:sz="0"/>
-          <w:right w:val="none" w:color="FFFFFF" w:sz="0"/>
-          <w:insideH w:val="none" w:color="FFFFFF" w:sz="0"/>
-          <w:insideV w:val="none" w:color="FFFFFF" w:sz="0"/>
-        </w:tblBorders>
-        <w:tblLayout w:type="fixed"/>
-      </w:tblPr>
-      <w:tblGrid>
-        <w:gridCol w:w="3401"/>
-        <w:gridCol w:w="3401"/>
-        <w:gridCol w:w="3402"/>
-      </w:tblGrid>
-      <w:tr>
-        <w:tc>
-          <w:tcPr>
-            <w:tcW w:type="dxa" w:w="3401"/>
-            <w:tcBorders>
-              <w:top w:val="none" w:color="FFFFFF" w:sz="0"/>
-              <w:left w:val="none" w:color="FFFFFF" w:sz="0"/>
-              <w:bottom w:val="none" w:color="FFFFFF" w:sz="0"/>
-              <w:right w:val="none" w:color="FFFFFF" w:sz="0"/>
-            </w:tcBorders>
-            <w:tcMar>
-              <w:top w:type="dxa" w:w="80"/>
-              <w:left w:type="dxa" w:w="100"/>
-              <w:bottom w:type="dxa" w:w="80"/>
-              <w:right w:type="dxa" w:w="100"/>
-            </w:tcMar>
-          </w:tcPr>
-          <w:p>
-            <w:pPr>
-              <w:spacing w:after="20" w:before="0"/>
-            </w:pPr>
-            <w:r>
-              <w:rPr>
-                <w:rFonts w:ascii="Arial" w:cs="Arial" w:eastAsia="Arial" w:hAnsi="Arial"/>
-                <w:b/>
-                <w:bCs/>
-                <w:caps/>
-                <w:color w:val="7C6E65"/>
-                <w:spacing w:val="10"/>
-                <w:sz w:val="14"/>
-                <w:szCs w:val="14"/>
-              </w:rPr>
-              <w:t xml:space="preserve">Größe</w:t>
-            </w:r>
-          </w:p>
-          <w:p>
-            <w:pPr>
-              <w:pBdr>
-                <w:bottom w:val="single" w:color="7C6E65" w:sz="6" w:space="1"/>
-              </w:pBdr>
-              <w:tabs>
-                <w:tab w:val="right" w:pos="3181"/>
-              </w:tabs>
-              <w:spacing w:after="0" w:before="340"/>
-            </w:pPr>
-            <w:r>
-              <w:rPr>
-                <w:rFonts w:ascii="Arial" w:cs="Arial" w:eastAsia="Arial" w:hAnsi="Arial"/>
-                <w:color w:val="7C6E65"/>
-                <w:sz w:val="16"/>
-                <w:szCs w:val="16"/>
-              </w:rPr>
-              <w:t xml:space="preserve">	cm</w:t>
-            </w:r>
-          </w:p>
-        </w:tc>
-        <w:tc>
-          <w:tcPr>
-            <w:tcW w:type="dxa" w:w="3401"/>
-            <w:tcBorders>
-              <w:top w:val="none" w:color="FFFFFF" w:sz="0"/>
-              <w:left w:val="none" w:color="FFFFFF" w:sz="0"/>
-              <w:bottom w:val="none" w:color="FFFFFF" w:sz="0"/>
-              <w:right w:val="none" w:color="FFFFFF" w:sz="0"/>
-            </w:tcBorders>
-            <w:tcMar>
-              <w:top w:type="dxa" w:w="80"/>
-              <w:left w:type="dxa" w:w="100"/>
-              <w:bottom w:type="dxa" w:w="80"/>
-              <w:right w:type="dxa" w:w="100"/>
-            </w:tcMar>
-          </w:tcPr>
-          <w:p>
-            <w:pPr>
-              <w:spacing w:after="20" w:before="0"/>
-            </w:pPr>
-            <w:r>
-              <w:rPr>
-                <w:rFonts w:ascii="Arial" w:cs="Arial" w:eastAsia="Arial" w:hAnsi="Arial"/>
-                <w:b/>
-                <w:bCs/>
-                <w:caps/>
-                <w:color w:val="7C6E65"/>
-                <w:spacing w:val="10"/>
-                <w:sz w:val="14"/>
-                <w:szCs w:val="14"/>
-              </w:rPr>
-              <w:t xml:space="preserve">Gewicht</w:t>
-            </w:r>
-          </w:p>
-          <w:p>
-            <w:pPr>
-              <w:pBdr>
-                <w:bottom w:val="single" w:color="7C6E65" w:sz="6" w:space="1"/>
-              </w:pBdr>
-              <w:tabs>
-                <w:tab w:val="right" w:pos="3181"/>
-              </w:tabs>
-              <w:spacing w:after="0" w:before="340"/>
-            </w:pPr>
-            <w:r>
-              <w:rPr>
-                <w:rFonts w:ascii="Arial" w:cs="Arial" w:eastAsia="Arial" w:hAnsi="Arial"/>
-                <w:color w:val="7C6E65"/>
-                <w:sz w:val="16"/>
-                <w:szCs w:val="16"/>
-              </w:rPr>
-              <w:t xml:space="preserve">	kg</w:t>
-            </w:r>
-          </w:p>
-        </w:tc>
-        <w:tc>
-          <w:tcPr>
-            <w:tcW w:type="dxa" w:w="3402"/>
-            <w:tcBorders>
-              <w:top w:val="none" w:color="FFFFFF" w:sz="0"/>
-              <w:left w:val="none" w:color="FFFFFF" w:sz="0"/>
-              <w:bottom w:val="none" w:color="FFFFFF" w:sz="0"/>
-              <w:right w:val="none" w:color="FFFFFF" w:sz="0"/>
-            </w:tcBorders>
-            <w:tcMar>
-              <w:top w:type="dxa" w:w="80"/>
-              <w:left w:type="dxa" w:w="100"/>
-              <w:bottom w:type="dxa" w:w="80"/>
-              <w:right w:type="dxa" w:w="100"/>
-            </w:tcMar>
-          </w:tcPr>
-          <w:p>
-            <w:pPr>
-              <w:spacing w:after="20" w:before="0"/>
-            </w:pPr>
-            <w:r>
-              <w:rPr>
-                <w:rFonts w:ascii="Arial" w:cs="Arial" w:eastAsia="Arial" w:hAnsi="Arial"/>
-                <w:b/>
-                <w:bCs/>
-                <w:caps/>
-                <w:color w:val="7C6E65"/>
-                <w:spacing w:val="10"/>
-                <w:sz w:val="14"/>
-                <w:szCs w:val="14"/>
-              </w:rPr>
-              <w:t xml:space="preserve">Handynummer</w:t>
-            </w:r>
-          </w:p>
-          <w:p>
-            <w:pPr>
-              <w:pBdr>
-                <w:bottom w:val="single" w:color="7C6E65" w:sz="6" w:space="1"/>
-              </w:pBdr>
-              <w:tabs>
-                <w:tab w:val="right" w:pos="3182"/>
-              </w:tabs>
-              <w:spacing w:after="0" w:before="340"/>
-            </w:pPr>
-            <w:r>
-              <w:rPr>
-                <w:rFonts w:ascii="Arial" w:cs="Arial" w:eastAsia="Arial" w:hAnsi="Arial"/>
-                <w:color w:val="7C6E65"/>
-                <w:sz w:val="16"/>
-                <w:szCs w:val="16"/>
-              </w:rPr>
-              <w:t xml:space="preserve"/>
-            </w:r>
-          </w:p>
-        </w:tc>
-      </w:tr>
-    </w:tbl>
-    <w:tbl>
-      <w:tblPr>
-        <w:tblW w:type="dxa" w:w="10204"/>
-        <w:tblBorders>
-          <w:top w:val="none" w:color="FFFFFF" w:sz="0"/>
-          <w:left w:val="none" w:color="FFFFFF" w:sz="0"/>
-          <w:bottom w:val="none" w:color="FFFFFF" w:sz="0"/>
-          <w:right w:val="none" w:color="FFFFFF" w:sz="0"/>
-          <w:insideH w:val="none" w:color="FFFFFF" w:sz="0"/>
-          <w:insideV w:val="none" w:color="FFFFFF" w:sz="0"/>
-        </w:tblBorders>
-        <w:tblLayout w:type="fixed"/>
-      </w:tblPr>
-      <w:tblGrid>
-        <w:gridCol w:w="10204"/>
-      </w:tblGrid>
-      <w:tr>
-        <w:tc>
-          <w:tcPr>
-            <w:tcW w:type="dxa" w:w="10204"/>
-            <w:tcBorders>
-              <w:top w:val="none" w:color="FFFFFF" w:sz="0"/>
-              <w:left w:val="none" w:color="FFFFFF" w:sz="0"/>
-              <w:bottom w:val="none" w:color="FFFFFF" w:sz="0"/>
-              <w:right w:val="none" w:color="FFFFFF" w:sz="0"/>
-            </w:tcBorders>
-            <w:tcMar>
-              <w:top w:type="dxa" w:w="80"/>
-              <w:left w:type="dxa" w:w="100"/>
-              <w:bottom w:type="dxa" w:w="80"/>
-              <w:right w:type="dxa" w:w="100"/>
-            </w:tcMar>
-          </w:tcPr>
-          <w:p>
-            <w:pPr>
-              <w:spacing w:after="20" w:before="0"/>
-            </w:pPr>
-            <w:r>
-              <w:rPr>
-                <w:rFonts w:ascii="Arial" w:cs="Arial" w:eastAsia="Arial" w:hAnsi="Arial"/>
-                <w:b/>
-                <w:bCs/>
-                <w:caps/>
-                <w:color w:val="7C6E65"/>
-                <w:spacing w:val="10"/>
-                <w:sz w:val="14"/>
-                <w:szCs w:val="14"/>
-              </w:rPr>
-              <w:t xml:space="preserve">E-Mail-Adresse</w:t>
-            </w:r>
-          </w:p>
-          <w:p>
-            <w:pPr>
-              <w:pBdr>
-                <w:bottom w:val="single" w:color="7C6E65" w:sz="6" w:space="1"/>
-              </w:pBdr>
-              <w:tabs>
-                <w:tab w:val="right" w:pos="9984"/>
-              </w:tabs>
-              <w:spacing w:after="0" w:before="340"/>
-            </w:pPr>
-            <w:r>
-              <w:rPr>
-                <w:rFonts w:ascii="Arial" w:cs="Arial" w:eastAsia="Arial" w:hAnsi="Arial"/>
-                <w:color w:val="7C6E65"/>
-                <w:sz w:val="16"/>
-                <w:szCs w:val="16"/>
-              </w:rPr>
-              <w:t xml:space="preserve"/>
-            </w:r>
-          </w:p>
-        </w:tc>
-      </w:tr>
-    </w:tbl>
-    <w:p>
-      <w:r>
-        <w:br w:type="page"/>
-      </w:r>
-    </w:p>
-    <w:tbl>
-      <w:tblPr>
-        <w:tblW w:type="dxa" w:w="10204"/>
-        <w:tblBorders>
-          <w:top w:val="none" w:color="FFFFFF" w:sz="0"/>
-          <w:left w:val="none" w:color="FFFFFF" w:sz="0"/>
-          <w:bottom w:val="none" w:color="FFFFFF" w:sz="0"/>
-          <w:right w:val="none" w:color="FFFFFF" w:sz="0"/>
-          <w:insideH w:val="none" w:color="FFFFFF" w:sz="0"/>
-          <w:insideV w:val="none" w:color="FFFFFF" w:sz="0"/>
-        </w:tblBorders>
-        <w:tblLayout w:type="fixed"/>
-      </w:tblPr>
-      <w:tblGrid>
-        <w:gridCol w:w="3000"/>
-        <w:gridCol w:w="6204"/>
-        <w:gridCol w:w="1000"/>
-      </w:tblGrid>
-      <w:tr>
-        <w:tc>
-          <w:tcPr>
-            <w:tcW w:type="dxa" w:w="3000"/>
-            <w:tcBorders>
-              <w:top w:val="none" w:color="FFFFFF" w:sz="0"/>
-              <w:left w:val="none" w:color="FFFFFF" w:sz="0"/>
-              <w:bottom w:val="none" w:color="FFFFFF" w:sz="0"/>
-              <w:right w:val="none" w:color="FFFFFF" w:sz="0"/>
-            </w:tcBorders>
-            <w:tcMar>
-              <w:top w:type="dxa" w:w="60"/>
-              <w:left w:type="dxa" w:w="0"/>
-              <w:bottom w:type="dxa" w:w="60"/>
-              <w:right w:type="dxa" w:w="100"/>
-            </w:tcMar>
-            <w:vAlign w:val="center"/>
-          </w:tcPr>
-          <w:p>
-            <w:pPr>
-              <w:spacing w:after="60" w:before="0"/>
-            </w:pPr>
-            <w:r>
-              <w:drawing>
-                <wp:inline distT="0" distB="0" distL="0" distR="0">
-                  <wp:extent cx="1428750" cy="466725"/>
-                  <wp:effectExtent t="0" r="0" b="0" l="0"/>
-                  <wp:docPr id="1" name="" descr="" title=""/>
-                  <wp:cNvGraphicFramePr>
-                    <a:graphicFrameLocks xmlns:a="http://schemas.openxmlformats.org/drawingml/2006/main" noChangeAspect="1"/>
-                  </wp:cNvGraphicFramePr>
-                  <a:graphic xmlns:a="http://schemas.openxmlformats.org/drawingml/2006/main">
-                    <a:graphicData uri="http://schemas.openxmlformats.org/drawingml/2006/picture">
-                      <pic:pic xmlns:pic="http://schemas.openxmlformats.org/drawingml/2006/picture">
-                        <pic:nvPicPr>
-                          <pic:cNvPr id="0" name="" descr=""/>
-                          <pic:cNvPicPr>
-                            <a:picLocks noChangeAspect="1" noChangeArrowheads="1"/>
-                          </pic:cNvPicPr>
-                        </pic:nvPicPr>
-                        <pic:blipFill>
-                          <a:blip r:embed="rId8" cstate="none"/>
-                          <a:srcRect/>
-                          <a:stretch>
-                            <a:fillRect/>
-                          </a:stretch>
-                        </pic:blipFill>
-                        <pic:spPr bwMode="auto">
-                          <a:xfrm>
-                            <a:off x="0" y="0"/>
-                            <a:ext cx="1428750" cy="466725"/>
-                          </a:xfrm>
-                          <a:prstGeom prst="rect">
-                            <a:avLst/>
-                          </a:prstGeom>
-                        </pic:spPr>
-                      </pic:pic>
-                    </a:graphicData>
-                  </a:graphic>
-                </wp:inline>
-              </w:drawing>
-            </w:r>
-          </w:p>
-        </w:tc>
-        <w:tc>
-          <w:tcPr>
-            <w:tcW w:type="dxa" w:w="6204"/>
-            <w:tcBorders>
-              <w:top w:val="none" w:color="FFFFFF" w:sz="0"/>
-              <w:left w:val="none" w:color="FFFFFF" w:sz="0"/>
-              <w:bottom w:val="none" w:color="FFFFFF" w:sz="0"/>
-              <w:right w:val="none" w:color="FFFFFF" w:sz="0"/>
-            </w:tcBorders>
-            <w:tcMar>
-              <w:top w:type="dxa" w:w="60"/>
-              <w:left w:type="dxa" w:w="100"/>
-              <w:bottom w:type="dxa" w:w="60"/>
-              <w:right w:type="dxa" w:w="100"/>
-            </w:tcMar>
-            <w:vAlign w:val="center"/>
-          </w:tcPr>
-          <w:p>
-            <w:pPr>
-              <w:spacing w:after="0" w:before="0"/>
-              <w:jc w:val="right"/>
-            </w:pPr>
-            <w:r>
-              <w:rPr>
-                <w:rFonts w:ascii="Arial" w:cs="Arial" w:eastAsia="Arial" w:hAnsi="Arial"/>
-                <w:b/>
-                <w:bCs/>
-                <w:caps/>
-                <w:color w:val="007478"/>
-                <w:spacing w:val="14"/>
-                <w:sz w:val="15"/>
-                <w:szCs w:val="15"/>
-              </w:rPr>
-              <w:t xml:space="preserve">CT-Diagnostik · Patienteninformation</w:t>
-            </w:r>
-          </w:p>
-          <w:p>
-            <w:pPr>
-              <w:spacing w:after="0" w:before="0"/>
-              <w:jc w:val="right"/>
-            </w:pPr>
-            <w:r>
-              <w:rPr>
-                <w:rFonts w:ascii="Arial" w:cs="Arial" w:eastAsia="Arial" w:hAnsi="Arial"/>
-                <w:caps/>
-                <w:color w:val="5D534C"/>
-                <w:sz w:val="34"/>
-                <w:szCs w:val="34"/>
-              </w:rPr>
-              <w:t xml:space="preserve">Aufklärung </w:t>
-            </w:r>
-            <w:r>
-              <w:rPr>
-                <w:rFonts w:ascii="Arial" w:cs="Arial" w:eastAsia="Arial" w:hAnsi="Arial"/>
-                <w:b/>
-                <w:bCs/>
-                <w:caps/>
-                <w:color w:val="08658E"/>
-                <w:sz w:val="34"/>
-                <w:szCs w:val="34"/>
-              </w:rPr>
-              <w:t xml:space="preserve">Herz-CT</w:t>
-            </w:r>
-          </w:p>
-        </w:tc>
-        <w:tc>
-          <w:tcPr>
-            <w:tcW w:type="dxa" w:w="1000"/>
-            <w:tcBorders>
-              <w:top w:val="none" w:color="FFFFFF" w:sz="0"/>
-              <w:left w:val="none" w:color="FFFFFF" w:sz="0"/>
-              <w:bottom w:val="none" w:color="FFFFFF" w:sz="0"/>
-              <w:right w:val="none" w:color="FFFFFF" w:sz="0"/>
-            </w:tcBorders>
-            <w:tcMar>
-              <w:top w:type="dxa" w:w="60"/>
-              <w:left w:type="dxa" w:w="100"/>
-              <w:bottom w:type="dxa" w:w="60"/>
-              <w:right w:type="dxa" w:w="0"/>
-            </w:tcMar>
-            <w:vAlign w:val="center"/>
-          </w:tcPr>
-          <w:p>
-            <w:pPr>
-              <w:spacing w:after="60" w:before="0"/>
-              <w:jc w:val="right"/>
-            </w:pPr>
-            <w:r>
-              <w:drawing>
-                <wp:inline distT="0" distB="0" distL="0" distR="0">
-                  <wp:extent cx="438150" cy="514350"/>
-                  <wp:effectExtent t="0" r="0" b="0" l="0"/>
-                  <wp:docPr id="1" name="" descr="" title=""/>
-                  <wp:cNvGraphicFramePr>
-                    <a:graphicFrameLocks xmlns:a="http://schemas.openxmlformats.org/drawingml/2006/main" noChangeAspect="1"/>
-                  </wp:cNvGraphicFramePr>
-                  <a:graphic xmlns:a="http://schemas.openxmlformats.org/drawingml/2006/main">
-                    <a:graphicData uri="http://schemas.openxmlformats.org/drawingml/2006/picture">
-                      <pic:pic xmlns:pic="http://schemas.openxmlformats.org/drawingml/2006/picture">
-                        <pic:nvPicPr>
-                          <pic:cNvPr id="0" name="" descr=""/>
-                          <pic:cNvPicPr>
-                            <a:picLocks noChangeAspect="1" noChangeArrowheads="1"/>
-                          </pic:cNvPicPr>
-                        </pic:nvPicPr>
-                        <pic:blipFill>
-                          <a:blip r:embed="rId9" cstate="none"/>
-                          <a:srcRect/>
-                          <a:stretch>
-                            <a:fillRect/>
-                          </a:stretch>
-                        </pic:blipFill>
-                        <pic:spPr bwMode="auto">
-                          <a:xfrm>
-                            <a:off x="0" y="0"/>
-                            <a:ext cx="438150" cy="514350"/>
-                          </a:xfrm>
-                          <a:prstGeom prst="rect">
-                            <a:avLst/>
-                          </a:prstGeom>
-                        </pic:spPr>
-                      </pic:pic>
-                    </a:graphicData>
-                  </a:graphic>
-                </wp:inline>
-              </w:drawing>
-            </w:r>
-          </w:p>
-        </w:tc>
-      </w:tr>
-    </w:tbl>
-    <w:p>
-      <w:pPr>
-        <w:pBdr>
-          <w:bottom w:val="single" w:color="007AA8" w:sz="12" w:space="1"/>
-        </w:pBdr>
-        <w:spacing w:after="60" w:before="0"/>
-      </w:pPr>
-      <w:r>
-        <w:rPr>
-          <w:rFonts w:ascii="Arial" w:cs="Arial" w:eastAsia="Arial" w:hAnsi="Arial"/>
-          <w:color w:val="5D534C"/>
-          <w:sz w:val="18"/>
-          <w:szCs w:val="18"/>
-        </w:rPr>
-        <w:t xml:space="preserve"/>
-      </w:r>
-    </w:p>
-    <w:p>
-      <w:pPr>
-        <w:keepNext/>
-        <w:tabs>
-          <w:tab w:val="right" w:pos="10204"/>
-        </w:tabs>
-        <w:spacing w:after="100" w:before="200"/>
-      </w:pPr>
-      <w:r>
-        <w:rPr>
-          <w:rFonts w:ascii="Arial" w:cs="Arial" w:eastAsia="Arial" w:hAnsi="Arial"/>
-          <w:b/>
-          <w:bCs/>
-          <w:color w:val="FFFFFF"/>
-          <w:sz w:val="18"/>
-          <w:szCs w:val="18"/>
-          <w:shd w:fill="007AA8" w:color="auto" w:val="clear"/>
-        </w:rPr>
-        <w:t xml:space="preserve"> 3 </w:t>
       </w:r>
       <w:r>
         <w:rPr>
@@ -2795,7 +2466,7 @@
               <w:tabs>
                 <w:tab w:val="right" w:pos="3657"/>
               </w:tabs>
-              <w:spacing w:after="0" w:before="480"/>
+              <w:spacing w:after="0" w:before="360"/>
             </w:pPr>
             <w:r>
               <w:rPr>
@@ -2850,7 +2521,7 @@
               <w:tabs>
                 <w:tab w:val="right" w:pos="6107"/>
               </w:tabs>
-              <w:spacing w:after="0" w:before="480"/>
+              <w:spacing w:after="0" w:before="360"/>
             </w:pPr>
             <w:r>
               <w:rPr>
@@ -2925,7 +2596,7 @@
               <w:tabs>
                 <w:tab w:val="right" w:pos="3657"/>
               </w:tabs>
-              <w:spacing w:after="0" w:before="480"/>
+              <w:spacing w:after="0" w:before="360"/>
             </w:pPr>
             <w:r>
               <w:rPr>
@@ -2980,7 +2651,7 @@
               <w:tabs>
                 <w:tab w:val="right" w:pos="6107"/>
               </w:tabs>
-              <w:spacing w:after="0" w:before="480"/>
+              <w:spacing w:after="0" w:before="360"/>
             </w:pPr>
             <w:r>
               <w:rPr>
@@ -2995,20 +2666,6 @@
         </w:tc>
       </w:tr>
     </w:tbl>
-    <w:p>
-      <w:pPr>
-        <w:spacing w:after="160" w:before="0"/>
-      </w:pPr>
-      <w:r>
-        <w:rPr>
-          <w:rFonts w:ascii="Arial" w:cs="Arial" w:eastAsia="Arial" w:hAnsi="Arial"/>
-          <w:color w:val="5D534C"/>
-          <w:sz w:val="18"/>
-          <w:szCs w:val="18"/>
-        </w:rPr>
-        <w:t xml:space="preserve"/>
-      </w:r>
-    </w:p>
     <w:p>
       <w:pPr>
         <w:keepNext/>
@@ -3182,20 +2839,6 @@
         </w:tc>
       </w:tr>
     </w:tbl>
-    <w:p>
-      <w:pPr>
-        <w:spacing w:after="80" w:before="0"/>
-      </w:pPr>
-      <w:r>
-        <w:rPr>
-          <w:rFonts w:ascii="Arial" w:cs="Arial" w:eastAsia="Arial" w:hAnsi="Arial"/>
-          <w:color w:val="5D534C"/>
-          <w:sz w:val="18"/>
-          <w:szCs w:val="18"/>
-        </w:rPr>
-        <w:t xml:space="preserve"/>
-      </w:r>
-    </w:p>
     <w:tbl>
       <w:tblPr>
         <w:tblW w:type="dxa" w:w="10204"/>
@@ -3320,7 +2963,7 @@
       </w:tr>
       <w:tr>
         <w:trPr>
-          <w:trHeight w:val="440" w:hRule="atLeast"/>
+          <w:trHeight w:val="380" w:hRule="atLeast"/>
         </w:trPr>
         <w:tc>
           <w:tcPr>
@@ -3418,7 +3061,7 @@
       </w:tr>
       <w:tr>
         <w:trPr>
-          <w:trHeight w:val="440" w:hRule="atLeast"/>
+          <w:trHeight w:val="380" w:hRule="atLeast"/>
         </w:trPr>
         <w:tc>
           <w:tcPr>
@@ -3516,105 +3159,7 @@
       </w:tr>
       <w:tr>
         <w:trPr>
-          <w:trHeight w:val="440" w:hRule="atLeast"/>
-        </w:trPr>
-        <w:tc>
-          <w:tcPr>
-            <w:tcW w:type="dxa" w:w="2653"/>
-            <w:tcBorders>
-              <w:top w:val="single" w:color="D4D0C5" w:sz="4"/>
-              <w:left w:val="single" w:color="D4D0C5" w:sz="4"/>
-              <w:bottom w:val="single" w:color="D4D0C5" w:sz="4"/>
-              <w:right w:val="single" w:color="D4D0C5" w:sz="4"/>
-            </w:tcBorders>
-            <w:tcMar>
-              <w:top w:type="dxa" w:w="60"/>
-              <w:left w:type="dxa" w:w="100"/>
-              <w:bottom w:type="dxa" w:w="60"/>
-              <w:right w:type="dxa" w:w="100"/>
-            </w:tcMar>
-          </w:tcPr>
-          <w:p>
-            <w:pPr>
-              <w:spacing w:after="60" w:before="0"/>
-            </w:pPr>
-            <w:r>
-              <w:rPr>
-                <w:rFonts w:ascii="Arial" w:cs="Arial" w:eastAsia="Arial" w:hAnsi="Arial"/>
-                <w:color w:val="5D534C"/>
-                <w:sz w:val="18"/>
-                <w:szCs w:val="18"/>
-              </w:rPr>
-              <w:t xml:space="preserve"/>
-            </w:r>
-          </w:p>
-        </w:tc>
-        <w:tc>
-          <w:tcPr>
-            <w:tcW w:type="dxa" w:w="3775"/>
-            <w:tcBorders>
-              <w:top w:val="single" w:color="D4D0C5" w:sz="4"/>
-              <w:left w:val="single" w:color="D4D0C5" w:sz="4"/>
-              <w:bottom w:val="single" w:color="D4D0C5" w:sz="4"/>
-              <w:right w:val="single" w:color="D4D0C5" w:sz="4"/>
-            </w:tcBorders>
-            <w:tcMar>
-              <w:top w:type="dxa" w:w="60"/>
-              <w:left w:type="dxa" w:w="100"/>
-              <w:bottom w:type="dxa" w:w="60"/>
-              <w:right w:type="dxa" w:w="100"/>
-            </w:tcMar>
-          </w:tcPr>
-          <w:p>
-            <w:pPr>
-              <w:spacing w:after="60" w:before="0"/>
-            </w:pPr>
-            <w:r>
-              <w:rPr>
-                <w:rFonts w:ascii="Arial" w:cs="Arial" w:eastAsia="Arial" w:hAnsi="Arial"/>
-                <w:color w:val="5D534C"/>
-                <w:sz w:val="18"/>
-                <w:szCs w:val="18"/>
-              </w:rPr>
-              <w:t xml:space="preserve"/>
-            </w:r>
-          </w:p>
-        </w:tc>
-        <w:tc>
-          <w:tcPr>
-            <w:tcW w:type="dxa" w:w="3776"/>
-            <w:tcBorders>
-              <w:top w:val="single" w:color="D4D0C5" w:sz="4"/>
-              <w:left w:val="single" w:color="D4D0C5" w:sz="4"/>
-              <w:bottom w:val="single" w:color="D4D0C5" w:sz="4"/>
-              <w:right w:val="single" w:color="D4D0C5" w:sz="4"/>
-            </w:tcBorders>
-            <w:tcMar>
-              <w:top w:type="dxa" w:w="60"/>
-              <w:left w:type="dxa" w:w="100"/>
-              <w:bottom w:type="dxa" w:w="60"/>
-              <w:right w:type="dxa" w:w="100"/>
-            </w:tcMar>
-          </w:tcPr>
-          <w:p>
-            <w:pPr>
-              <w:spacing w:after="60" w:before="0"/>
-            </w:pPr>
-            <w:r>
-              <w:rPr>
-                <w:rFonts w:ascii="Arial" w:cs="Arial" w:eastAsia="Arial" w:hAnsi="Arial"/>
-                <w:color w:val="5D534C"/>
-                <w:sz w:val="18"/>
-                <w:szCs w:val="18"/>
-              </w:rPr>
-              <w:t xml:space="preserve"/>
-            </w:r>
-          </w:p>
-        </w:tc>
-      </w:tr>
-      <w:tr>
-        <w:trPr>
-          <w:trHeight w:val="440" w:hRule="atLeast"/>
+          <w:trHeight w:val="380" w:hRule="atLeast"/>
         </w:trPr>
         <w:tc>
           <w:tcPr>

</xml_diff>